<commit_message>
add / update markdowns related to Fock-PARFLM
</commit_message>
<xml_diff>
--- a/docs/splm/Deep_Dive_in_the_SPLM_model_and_code.docx
+++ b/docs/splm/Deep_Dive_in_the_SPLM_model_and_code.docx
@@ -804,7 +804,21 @@
         <w:rPr>
           <w:rFonts w:eastAsiaTheme="minorEastAsia"/>
         </w:rPr>
-        <w:t xml:space="preserve"> and the gradient is taken only with respect to h, never </w:t>
+        <w:t xml:space="preserve"> and the gradient is taken only with respect to </w:t>
+      </w:r>
+      <m:oMath>
+        <m:r>
+          <w:rPr>
+            <w:rFonts w:ascii="Cambria Math" w:eastAsiaTheme="minorEastAsia" w:hAnsi="Cambria Math"/>
+          </w:rPr>
+          <m:t>h</m:t>
+        </m:r>
+      </m:oMath>
+      <w:r>
+        <w:rPr>
+          <w:rFonts w:eastAsiaTheme="minorEastAsia"/>
+        </w:rPr>
+        <w:t xml:space="preserve">, never </w:t>
       </w:r>
       <m:oMath>
         <m:r>
@@ -927,21 +941,606 @@
         <w:rPr>
           <w:rFonts w:eastAsiaTheme="minorEastAsia"/>
         </w:rPr>
-        <w:t xml:space="preserve"> is frozen – a conditioning variable, held constant while the differentiation on h is performed.    </w:t>
-      </w:r>
-    </w:p>
-    <w:p>
+        <w:t xml:space="preserve"> is frozen – a </w:t>
+      </w:r>
+      <w:r>
+        <w:rPr>
+          <w:rFonts w:eastAsiaTheme="minorEastAsia"/>
+          <w:i/>
+          <w:iCs/>
+        </w:rPr>
+        <w:t>conditioning variable</w:t>
+      </w:r>
+      <w:r>
+        <w:rPr>
+          <w:rFonts w:eastAsiaTheme="minorEastAsia"/>
+        </w:rPr>
+        <w:t xml:space="preserve">, held constant while the differentiation on </w:t>
+      </w:r>
+      <m:oMath>
+        <m:r>
+          <w:rPr>
+            <w:rFonts w:ascii="Cambria Math" w:eastAsiaTheme="minorEastAsia" w:hAnsi="Cambria Math"/>
+          </w:rPr>
+          <m:t>h</m:t>
+        </m:r>
+      </m:oMath>
+      <w:r>
+        <w:rPr>
+          <w:rFonts w:eastAsiaTheme="minorEastAsia"/>
+        </w:rPr>
+        <w:t xml:space="preserve"> is performed.    </w:t>
+      </w:r>
+    </w:p>
+    <w:p>
+      <w:pPr>
+        <w:rPr>
+          <w:rFonts w:eastAsiaTheme="minorEastAsia"/>
+        </w:rPr>
+      </w:pPr>
+      <w:r>
+        <w:rPr>
+          <w:rFonts w:eastAsiaTheme="minorEastAsia"/>
+        </w:rPr>
+        <w:t xml:space="preserve">Thus, for a fixed </w:t>
+      </w:r>
+      <m:oMath>
+        <m:r>
+          <w:rPr>
+            <w:rFonts w:ascii="Cambria Math" w:eastAsiaTheme="minorEastAsia" w:hAnsi="Cambria Math"/>
+          </w:rPr>
+          <m:t>ξ</m:t>
+        </m:r>
+      </m:oMath>
+      <w:r>
+        <w:rPr>
+          <w:rFonts w:eastAsiaTheme="minorEastAsia"/>
+        </w:rPr>
+        <w:t xml:space="preserve">, the map </w:t>
+      </w:r>
+      <m:oMath>
+        <m:r>
+          <w:rPr>
+            <w:rFonts w:ascii="Cambria Math" w:eastAsiaTheme="minorEastAsia" w:hAnsi="Cambria Math"/>
+          </w:rPr>
+          <m:t>h</m:t>
+        </m:r>
+        <m:r>
+          <w:rPr>
+            <w:rFonts w:ascii="Cambria Math" w:eastAsiaTheme="minorEastAsia" w:hAnsi="Cambria Math"/>
+          </w:rPr>
+          <m:t>↦</m:t>
+        </m:r>
+        <m:sSub>
+          <m:sSubPr>
+            <m:ctrlPr>
+              <w:rPr>
+                <w:rFonts w:ascii="Cambria Math" w:eastAsiaTheme="minorEastAsia" w:hAnsi="Cambria Math"/>
+                <w:i/>
+              </w:rPr>
+            </m:ctrlPr>
+          </m:sSubPr>
+          <m:e>
+            <m:r>
+              <w:rPr>
+                <w:rFonts w:ascii="Cambria Math" w:eastAsiaTheme="minorEastAsia" w:hAnsi="Cambria Math"/>
+              </w:rPr>
+              <m:t>V</m:t>
+            </m:r>
+          </m:e>
+          <m:sub>
+            <m:r>
+              <w:rPr>
+                <w:rFonts w:ascii="Cambria Math" w:eastAsiaTheme="minorEastAsia" w:hAnsi="Cambria Math"/>
+              </w:rPr>
+              <m:t>θ</m:t>
+            </m:r>
+          </m:sub>
+        </m:sSub>
+        <m:d>
+          <m:dPr>
+            <m:ctrlPr>
+              <w:rPr>
+                <w:rFonts w:ascii="Cambria Math" w:eastAsiaTheme="minorEastAsia" w:hAnsi="Cambria Math"/>
+                <w:i/>
+              </w:rPr>
+            </m:ctrlPr>
+          </m:dPr>
+          <m:e>
+            <m:r>
+              <w:rPr>
+                <w:rFonts w:ascii="Cambria Math" w:eastAsiaTheme="minorEastAsia" w:hAnsi="Cambria Math"/>
+              </w:rPr>
+              <m:t>ξ,h</m:t>
+            </m:r>
+          </m:e>
+        </m:d>
+      </m:oMath>
+      <w:r>
+        <w:rPr>
+          <w:rFonts w:eastAsiaTheme="minorEastAsia"/>
+        </w:rPr>
+        <w:t xml:space="preserve"> is an “honest” scalar potential and the step is pointwise conservative. </w:t>
+      </w:r>
+      <m:oMath>
+        <m:r>
+          <w:rPr>
+            <w:rFonts w:ascii="Cambria Math" w:eastAsiaTheme="minorEastAsia" w:hAnsi="Cambria Math"/>
+          </w:rPr>
+          <m:t>ξ</m:t>
+        </m:r>
+      </m:oMath>
+      <w:r>
+        <w:rPr>
+          <w:rFonts w:eastAsiaTheme="minorEastAsia"/>
+        </w:rPr>
+        <w:t xml:space="preserve"> acts as a context-dependent </w:t>
+      </w:r>
+      <w:r>
+        <w:rPr>
+          <w:rFonts w:eastAsiaTheme="minorEastAsia"/>
+          <w:i/>
+          <w:iCs/>
+        </w:rPr>
+        <w:t>reshaping</w:t>
+      </w:r>
+      <w:r>
+        <w:rPr>
+          <w:rFonts w:eastAsiaTheme="minorEastAsia"/>
+        </w:rPr>
+        <w:t xml:space="preserve"> of which scalar potential the token currently feels </w:t>
+      </w:r>
+      <w:r>
+        <w:rPr>
+          <w:rFonts w:eastAsiaTheme="minorEastAsia"/>
+        </w:rPr>
+        <w:t>–</w:t>
+      </w:r>
       <w:r>
         <w:rPr>
           <w:rFonts w:eastAsiaTheme="minorEastAsia"/>
         </w:rPr>
         <w:t xml:space="preserve"> </w:t>
+      </w:r>
+      <w:r>
+        <w:rPr>
+          <w:rFonts w:eastAsiaTheme="minorEastAsia"/>
+        </w:rPr>
+        <w:t xml:space="preserve">different tokens (and, in the re-pooled variants, different layers) see different slices </w:t>
+      </w:r>
+      <m:oMath>
+        <m:sSub>
+          <m:sSubPr>
+            <m:ctrlPr>
+              <w:rPr>
+                <w:rFonts w:ascii="Cambria Math" w:eastAsiaTheme="minorEastAsia" w:hAnsi="Cambria Math"/>
+                <w:i/>
+              </w:rPr>
+            </m:ctrlPr>
+          </m:sSubPr>
+          <m:e>
+            <m:r>
+              <w:rPr>
+                <w:rFonts w:ascii="Cambria Math" w:eastAsiaTheme="minorEastAsia" w:hAnsi="Cambria Math"/>
+              </w:rPr>
+              <m:t>V</m:t>
+            </m:r>
+          </m:e>
+          <m:sub>
+            <m:r>
+              <w:rPr>
+                <w:rFonts w:ascii="Cambria Math" w:eastAsiaTheme="minorEastAsia" w:hAnsi="Cambria Math"/>
+              </w:rPr>
+              <m:t>θ</m:t>
+            </m:r>
+          </m:sub>
+        </m:sSub>
+        <m:d>
+          <m:dPr>
+            <m:ctrlPr>
+              <w:rPr>
+                <w:rFonts w:ascii="Cambria Math" w:eastAsiaTheme="minorEastAsia" w:hAnsi="Cambria Math"/>
+                <w:i/>
+              </w:rPr>
+            </m:ctrlPr>
+          </m:dPr>
+          <m:e>
+            <m:r>
+              <w:rPr>
+                <w:rFonts w:ascii="Cambria Math" w:eastAsiaTheme="minorEastAsia" w:hAnsi="Cambria Math"/>
+              </w:rPr>
+              <m:t>ξ,</m:t>
+            </m:r>
+            <m:r>
+              <w:rPr>
+                <w:rFonts w:ascii="Cambria Math" w:eastAsiaTheme="minorEastAsia" w:hAnsi="Cambria Math"/>
+              </w:rPr>
+              <m:t>∙</m:t>
+            </m:r>
+          </m:e>
+        </m:d>
+      </m:oMath>
+      <w:r>
+        <w:rPr>
+          <w:rFonts w:eastAsiaTheme="minorEastAsia"/>
+        </w:rPr>
+        <w:t xml:space="preserve"> of the same </w:t>
+      </w:r>
+      <w:r>
+        <w:rPr>
+          <w:rFonts w:eastAsiaTheme="minorEastAsia"/>
+        </w:rPr>
+        <w:t xml:space="preserve">underlying two-argument function, but each slice is still a scalar field in </w:t>
+      </w:r>
+      <m:oMath>
+        <m:r>
+          <w:rPr>
+            <w:rFonts w:ascii="Cambria Math" w:eastAsiaTheme="minorEastAsia" w:hAnsi="Cambria Math"/>
+          </w:rPr>
+          <m:t>h</m:t>
+        </m:r>
+      </m:oMath>
+      <w:r>
+        <w:rPr>
+          <w:rFonts w:eastAsiaTheme="minorEastAsia"/>
+        </w:rPr>
+        <w:t xml:space="preserve">. </w:t>
+      </w:r>
+    </w:p>
+    <w:p>
+      <w:pPr>
+        <w:rPr>
+          <w:rFonts w:eastAsiaTheme="minorEastAsia"/>
+        </w:rPr>
+      </w:pPr>
+      <w:r>
+        <w:rPr>
+          <w:rFonts w:eastAsiaTheme="minorEastAsia"/>
+        </w:rPr>
+        <w:t xml:space="preserve">The scalar potential </w:t>
+      </w:r>
+      <m:oMath>
+        <m:sSub>
+          <m:sSubPr>
+            <m:ctrlPr>
+              <w:rPr>
+                <w:rFonts w:ascii="Cambria Math" w:eastAsiaTheme="minorEastAsia" w:hAnsi="Cambria Math"/>
+                <w:i/>
+              </w:rPr>
+            </m:ctrlPr>
+          </m:sSubPr>
+          <m:e>
+            <m:r>
+              <w:rPr>
+                <w:rFonts w:ascii="Cambria Math" w:eastAsiaTheme="minorEastAsia" w:hAnsi="Cambria Math"/>
+              </w:rPr>
+              <m:t>V</m:t>
+            </m:r>
+          </m:e>
+          <m:sub>
+            <m:r>
+              <w:rPr>
+                <w:rFonts w:ascii="Cambria Math" w:eastAsiaTheme="minorEastAsia" w:hAnsi="Cambria Math"/>
+              </w:rPr>
+              <m:t>θ</m:t>
+            </m:r>
+          </m:sub>
+        </m:sSub>
+      </m:oMath>
+      <w:r>
+        <w:rPr>
+          <w:rFonts w:eastAsiaTheme="minorEastAsia"/>
+        </w:rPr>
+        <w:t xml:space="preserve"> is an MLP whose learned weights are </w:t>
+      </w:r>
+      <m:oMath>
+        <m:r>
+          <w:rPr>
+            <w:rFonts w:ascii="Cambria Math" w:eastAsiaTheme="minorEastAsia" w:hAnsi="Cambria Math"/>
+          </w:rPr>
+          <m:t>θ</m:t>
+        </m:r>
+      </m:oMath>
+      <w:r>
+        <w:rPr>
+          <w:rFonts w:eastAsiaTheme="minorEastAsia"/>
+        </w:rPr>
+        <w:t xml:space="preserve">; it takes two inputs </w:t>
+      </w:r>
+      <m:oMath>
+        <m:d>
+          <m:dPr>
+            <m:ctrlPr>
+              <w:rPr>
+                <w:rFonts w:ascii="Cambria Math" w:eastAsiaTheme="minorEastAsia" w:hAnsi="Cambria Math"/>
+                <w:i/>
+              </w:rPr>
+            </m:ctrlPr>
+          </m:dPr>
+          <m:e>
+            <m:r>
+              <w:rPr>
+                <w:rFonts w:ascii="Cambria Math" w:eastAsiaTheme="minorEastAsia" w:hAnsi="Cambria Math"/>
+              </w:rPr>
+              <m:t>ξ,h</m:t>
+            </m:r>
+          </m:e>
+        </m:d>
+      </m:oMath>
+      <w:r>
+        <w:rPr>
+          <w:rFonts w:eastAsiaTheme="minorEastAsia"/>
+        </w:rPr>
+        <w:t xml:space="preserve">; </w:t>
+      </w:r>
+      <m:oMath>
+        <m:r>
+          <w:rPr>
+            <w:rFonts w:ascii="Cambria Math" w:eastAsiaTheme="minorEastAsia" w:hAnsi="Cambria Math"/>
+          </w:rPr>
+          <m:t>ξ</m:t>
+        </m:r>
+      </m:oMath>
+      <w:r>
+        <w:rPr>
+          <w:rFonts w:eastAsiaTheme="minorEastAsia"/>
+        </w:rPr>
+        <w:t xml:space="preserve"> is a frozen conditioning input that selects a potential slice while </w:t>
+      </w:r>
+      <m:oMath>
+        <m:r>
+          <w:rPr>
+            <w:rFonts w:ascii="Cambria Math" w:eastAsiaTheme="minorEastAsia" w:hAnsi="Cambria Math"/>
+          </w:rPr>
+          <m:t>h</m:t>
+        </m:r>
+      </m:oMath>
+      <w:r>
+        <w:rPr>
+          <w:rFonts w:eastAsiaTheme="minorEastAsia"/>
+        </w:rPr>
+        <w:t xml:space="preserve"> is the differentiation variable which negative gradient is the conservative force.  </w:t>
+      </w:r>
+      <m:oMath>
+        <m:sSub>
+          <m:sSubPr>
+            <m:ctrlPr>
+              <w:rPr>
+                <w:rFonts w:ascii="Cambria Math" w:eastAsiaTheme="minorEastAsia" w:hAnsi="Cambria Math"/>
+                <w:i/>
+              </w:rPr>
+            </m:ctrlPr>
+          </m:sSubPr>
+          <m:e>
+            <m:r>
+              <w:rPr>
+                <w:rFonts w:ascii="Cambria Math" w:eastAsiaTheme="minorEastAsia" w:hAnsi="Cambria Math"/>
+              </w:rPr>
+              <m:t>V</m:t>
+            </m:r>
+          </m:e>
+          <m:sub>
+            <m:r>
+              <w:rPr>
+                <w:rFonts w:ascii="Cambria Math" w:eastAsiaTheme="minorEastAsia" w:hAnsi="Cambria Math"/>
+              </w:rPr>
+              <m:t>ψ</m:t>
+            </m:r>
+          </m:sub>
+        </m:sSub>
+        <m:d>
+          <m:dPr>
+            <m:ctrlPr>
+              <w:rPr>
+                <w:rFonts w:ascii="Cambria Math" w:eastAsiaTheme="minorEastAsia" w:hAnsi="Cambria Math"/>
+                <w:i/>
+              </w:rPr>
+            </m:ctrlPr>
+          </m:dPr>
+          <m:e>
+            <m:r>
+              <w:rPr>
+                <w:rFonts w:ascii="Cambria Math" w:eastAsiaTheme="minorEastAsia" w:hAnsi="Cambria Math"/>
+              </w:rPr>
+              <m:t>h</m:t>
+            </m:r>
+          </m:e>
+        </m:d>
+      </m:oMath>
+      <w:r>
+        <w:rPr>
+          <w:rFonts w:eastAsiaTheme="minorEastAsia"/>
+        </w:rPr>
+        <w:t xml:space="preserve"> with no argument </w:t>
+      </w:r>
+      <m:oMath>
+        <m:r>
+          <w:rPr>
+            <w:rFonts w:ascii="Cambria Math" w:eastAsiaTheme="minorEastAsia" w:hAnsi="Cambria Math"/>
+          </w:rPr>
+          <m:t>ξ</m:t>
+        </m:r>
+      </m:oMath>
+      <w:r>
+        <w:rPr>
+          <w:rFonts w:eastAsiaTheme="minorEastAsia"/>
+        </w:rPr>
+        <w:t xml:space="preserve"> cannot represent the </w:t>
+      </w:r>
+      <m:oMath>
+        <m:r>
+          <w:rPr>
+            <w:rFonts w:ascii="Cambria Math" w:eastAsiaTheme="minorEastAsia" w:hAnsi="Cambria Math"/>
+          </w:rPr>
+          <m:t>ξ</m:t>
+        </m:r>
+      </m:oMath>
+      <w:r>
+        <w:rPr>
+          <w:rFonts w:eastAsiaTheme="minorEastAsia"/>
+        </w:rPr>
+        <w:t xml:space="preserve">-conditioning. The missing conditioning is one of the two factors which are the source of the gap between the oracle’s 0.931 and the perfect 1.0 on the LN variant. </w:t>
+      </w:r>
+    </w:p>
+    <w:p>
+      <w:pPr>
+        <w:rPr>
+          <w:rFonts w:eastAsiaTheme="minorEastAsia"/>
+        </w:rPr>
+      </w:pPr>
+      <w:r>
+        <w:rPr>
+          <w:rFonts w:eastAsiaTheme="minorEastAsia"/>
+        </w:rPr>
+        <w:t xml:space="preserve"> </w:t>
+      </w:r>
+    </w:p>
+    <w:p>
+      <w:pPr>
+        <w:rPr>
+          <w:rFonts w:eastAsiaTheme="minorEastAsia"/>
+          <w:u w:val="single"/>
+        </w:rPr>
+      </w:pPr>
+      <w:r>
+        <w:rPr>
+          <w:rFonts w:eastAsiaTheme="minorEastAsia"/>
+          <w:u w:val="single"/>
+        </w:rPr>
+        <w:t>A Note on the oracle fit</w:t>
+      </w:r>
+    </w:p>
+    <w:p>
+      <w:r>
+        <w:t>The oracle (</w:t>
+      </w:r>
+      <w:r>
+        <w:rPr>
+          <w:rFonts w:ascii="Consolas" w:hAnsi="Consolas" w:cs="Consolas"/>
+          <w:color w:val="C00000"/>
+          <w:sz w:val="17"/>
+          <w:szCs w:val="17"/>
+        </w:rPr>
+        <w:t>splm_oracle_fit.py</w:t>
+      </w:r>
+      <w:r>
+        <w:t xml:space="preserve">) is the ordinary shared-potential regression with one substitution – instead of training a fresh generic </w:t>
+      </w:r>
+      <m:oMath>
+        <m:sSub>
+          <m:sSubPr>
+            <m:ctrlPr>
+              <w:rPr>
+                <w:rFonts w:ascii="Cambria Math" w:eastAsiaTheme="minorEastAsia" w:hAnsi="Cambria Math"/>
+                <w:i/>
+              </w:rPr>
+            </m:ctrlPr>
+          </m:sSubPr>
+          <m:e>
+            <m:r>
+              <w:rPr>
+                <w:rFonts w:ascii="Cambria Math" w:eastAsiaTheme="minorEastAsia" w:hAnsi="Cambria Math"/>
+              </w:rPr>
+              <m:t>V</m:t>
+            </m:r>
+          </m:e>
+          <m:sub>
+            <m:r>
+              <w:rPr>
+                <w:rFonts w:ascii="Cambria Math" w:eastAsiaTheme="minorEastAsia" w:hAnsi="Cambria Math"/>
+              </w:rPr>
+              <m:t>ψ</m:t>
+            </m:r>
+          </m:sub>
+        </m:sSub>
+        <m:d>
+          <m:dPr>
+            <m:ctrlPr>
+              <w:rPr>
+                <w:rFonts w:ascii="Cambria Math" w:eastAsiaTheme="minorEastAsia" w:hAnsi="Cambria Math"/>
+                <w:i/>
+              </w:rPr>
+            </m:ctrlPr>
+          </m:dPr>
+          <m:e>
+            <m:r>
+              <w:rPr>
+                <w:rFonts w:ascii="Cambria Math" w:eastAsiaTheme="minorEastAsia" w:hAnsi="Cambria Math"/>
+              </w:rPr>
+              <m:t>h</m:t>
+            </m:r>
+          </m:e>
+        </m:d>
+      </m:oMath>
+      <w:r>
+        <w:rPr>
+          <w:rFonts w:eastAsiaTheme="minorEastAsia"/>
+        </w:rPr>
+        <w:t xml:space="preserve">, it plugs in the model’s own learned </w:t>
+      </w:r>
+      <m:oMath>
+        <m:sSub>
+          <m:sSubPr>
+            <m:ctrlPr>
+              <w:rPr>
+                <w:rFonts w:ascii="Cambria Math" w:eastAsiaTheme="minorEastAsia" w:hAnsi="Cambria Math"/>
+                <w:i/>
+              </w:rPr>
+            </m:ctrlPr>
+          </m:sSubPr>
+          <m:e>
+            <m:r>
+              <w:rPr>
+                <w:rFonts w:ascii="Cambria Math" w:eastAsiaTheme="minorEastAsia" w:hAnsi="Cambria Math"/>
+              </w:rPr>
+              <m:t>V</m:t>
+            </m:r>
+          </m:e>
+          <m:sub>
+            <m:r>
+              <w:rPr>
+                <w:rFonts w:ascii="Cambria Math" w:eastAsiaTheme="minorEastAsia" w:hAnsi="Cambria Math"/>
+              </w:rPr>
+              <m:t>θ</m:t>
+            </m:r>
+          </m:sub>
+        </m:sSub>
+        <m:d>
+          <m:dPr>
+            <m:ctrlPr>
+              <w:rPr>
+                <w:rFonts w:ascii="Cambria Math" w:eastAsiaTheme="minorEastAsia" w:hAnsi="Cambria Math"/>
+                <w:i/>
+              </w:rPr>
+            </m:ctrlPr>
+          </m:dPr>
+          <m:e>
+            <m:r>
+              <w:rPr>
+                <w:rFonts w:ascii="Cambria Math" w:eastAsiaTheme="minorEastAsia" w:hAnsi="Cambria Math"/>
+              </w:rPr>
+              <m:t>ξ,h</m:t>
+            </m:r>
+          </m:e>
+        </m:d>
+      </m:oMath>
+      <w:r>
+        <w:rPr>
+          <w:rFonts w:eastAsiaTheme="minorEastAsia"/>
+        </w:rPr>
+        <w:t xml:space="preserve"> and fits only the two per-layer scalars by closed-form least squares ( fit_scalars ) </w:t>
       </w:r>
     </w:p>
     <w:p>
       <w:pPr>
         <w:pStyle w:val="Heading1"/>
       </w:pPr>
+    </w:p>
+    <w:p/>
+    <w:p>
+      <w:pPr>
+        <w:pStyle w:val="Heading1"/>
+      </w:pPr>
       <w:r>
         <w:br/>
         <w:t>References</w:t>
@@ -960,6 +1559,255 @@
     <w:p>
       <w:r>
         <w:t>[3]</w:t>
+      </w:r>
+    </w:p>
+    <w:p/>
+    <w:p>
+      <w:pPr>
+        <w:pStyle w:val="Heading1"/>
+      </w:pPr>
+      <w:r>
+        <w:t>Appendix</w:t>
+      </w:r>
+    </w:p>
+    <w:p/>
+    <w:p>
+      <w:pPr>
+        <w:pStyle w:val="Heading2"/>
+        <w:rPr>
+          <w:rFonts w:ascii="Consolas" w:hAnsi="Consolas" w:cs="Consolas"/>
+        </w:rPr>
+      </w:pPr>
+      <w:r>
+        <w:t xml:space="preserve">Function </w:t>
+      </w:r>
+      <w:r>
+        <w:rPr>
+          <w:rFonts w:ascii="Consolas" w:hAnsi="Consolas" w:cs="Consolas"/>
+        </w:rPr>
+        <w:t>oracle_fit</w:t>
+      </w:r>
+    </w:p>
+    <w:p/>
+    <w:p>
+      <w:pPr>
+        <w:rPr>
+          <w:rFonts w:ascii="Consolas" w:hAnsi="Consolas" w:cs="Consolas"/>
+          <w:sz w:val="17"/>
+          <w:szCs w:val="17"/>
+        </w:rPr>
+      </w:pPr>
+      <w:r>
+        <w:rPr>
+          <w:rFonts w:ascii="Consolas" w:hAnsi="Consolas" w:cs="Consolas"/>
+          <w:sz w:val="17"/>
+          <w:szCs w:val="17"/>
+        </w:rPr>
+        <w:t>def fit_scalars(V: np.ndarray, G: np.ndarray, Y: np.ndarray, LAY: np.ndarray):</w:t>
+      </w:r>
+    </w:p>
+    <w:p>
+      <w:pPr>
+        <w:rPr>
+          <w:rFonts w:ascii="Consolas" w:hAnsi="Consolas" w:cs="Consolas"/>
+          <w:sz w:val="17"/>
+          <w:szCs w:val="17"/>
+        </w:rPr>
+      </w:pPr>
+      <w:r>
+        <w:rPr>
+          <w:rFonts w:ascii="Consolas" w:hAnsi="Consolas" w:cs="Consolas"/>
+          <w:sz w:val="17"/>
+          <w:szCs w:val="17"/>
+        </w:rPr>
+        <w:t xml:space="preserve">    """Per-layer least-squares: [alpha_l, beta_l] = argmin || Y - alpha V - beta*(-G) ||^2."""</w:t>
+      </w:r>
+    </w:p>
+    <w:p>
+      <w:pPr>
+        <w:rPr>
+          <w:rFonts w:ascii="Consolas" w:hAnsi="Consolas" w:cs="Consolas"/>
+          <w:sz w:val="17"/>
+          <w:szCs w:val="17"/>
+        </w:rPr>
+      </w:pPr>
+      <w:r>
+        <w:rPr>
+          <w:rFonts w:ascii="Consolas" w:hAnsi="Consolas" w:cs="Consolas"/>
+          <w:sz w:val="17"/>
+          <w:szCs w:val="17"/>
+        </w:rPr>
+        <w:t xml:space="preserve">    alpha = {}; beta = {}</w:t>
+      </w:r>
+    </w:p>
+    <w:p>
+      <w:pPr>
+        <w:rPr>
+          <w:rFonts w:ascii="Consolas" w:hAnsi="Consolas" w:cs="Consolas"/>
+          <w:sz w:val="17"/>
+          <w:szCs w:val="17"/>
+        </w:rPr>
+      </w:pPr>
+      <w:r>
+        <w:rPr>
+          <w:rFonts w:ascii="Consolas" w:hAnsi="Consolas" w:cs="Consolas"/>
+          <w:sz w:val="17"/>
+          <w:szCs w:val="17"/>
+        </w:rPr>
+        <w:t xml:space="preserve">    Y_pred = np.zeros_like(Y)</w:t>
+      </w:r>
+    </w:p>
+    <w:p>
+      <w:pPr>
+        <w:rPr>
+          <w:rFonts w:ascii="Consolas" w:hAnsi="Consolas" w:cs="Consolas"/>
+          <w:sz w:val="17"/>
+          <w:szCs w:val="17"/>
+        </w:rPr>
+      </w:pPr>
+      <w:r>
+        <w:rPr>
+          <w:rFonts w:ascii="Consolas" w:hAnsi="Consolas" w:cs="Consolas"/>
+          <w:sz w:val="17"/>
+          <w:szCs w:val="17"/>
+        </w:rPr>
+        <w:t xml:space="preserve">    for ell in np.unique(LAY):</w:t>
+      </w:r>
+    </w:p>
+    <w:p>
+      <w:pPr>
+        <w:rPr>
+          <w:rFonts w:ascii="Consolas" w:hAnsi="Consolas" w:cs="Consolas"/>
+          <w:sz w:val="17"/>
+          <w:szCs w:val="17"/>
+        </w:rPr>
+      </w:pPr>
+      <w:r>
+        <w:rPr>
+          <w:rFonts w:ascii="Consolas" w:hAnsi="Consolas" w:cs="Consolas"/>
+          <w:sz w:val="17"/>
+          <w:szCs w:val="17"/>
+        </w:rPr>
+        <w:t xml:space="preserve">        m = LAY == ell</w:t>
+      </w:r>
+    </w:p>
+    <w:p>
+      <w:pPr>
+        <w:rPr>
+          <w:rFonts w:ascii="Consolas" w:hAnsi="Consolas" w:cs="Consolas"/>
+          <w:sz w:val="17"/>
+          <w:szCs w:val="17"/>
+        </w:rPr>
+      </w:pPr>
+      <w:r>
+        <w:rPr>
+          <w:rFonts w:ascii="Consolas" w:hAnsi="Consolas" w:cs="Consolas"/>
+          <w:sz w:val="17"/>
+          <w:szCs w:val="17"/>
+        </w:rPr>
+        <w:t xml:space="preserve">        v = V[m].reshape(-1); g = (-G[m]).reshape(-1); y = Y[m].reshape(-1)</w:t>
+      </w:r>
+    </w:p>
+    <w:p>
+      <w:pPr>
+        <w:rPr>
+          <w:rFonts w:ascii="Consolas" w:hAnsi="Consolas" w:cs="Consolas"/>
+          <w:sz w:val="17"/>
+          <w:szCs w:val="17"/>
+        </w:rPr>
+      </w:pPr>
+      <w:r>
+        <w:rPr>
+          <w:rFonts w:ascii="Consolas" w:hAnsi="Consolas" w:cs="Consolas"/>
+          <w:sz w:val="17"/>
+          <w:szCs w:val="17"/>
+        </w:rPr>
+        <w:t xml:space="preserve">        A = np.stack([v, g], axis=1)  # (N*d, 2)</w:t>
+      </w:r>
+    </w:p>
+    <w:p>
+      <w:pPr>
+        <w:rPr>
+          <w:rFonts w:ascii="Consolas" w:hAnsi="Consolas" w:cs="Consolas"/>
+          <w:sz w:val="17"/>
+          <w:szCs w:val="17"/>
+        </w:rPr>
+      </w:pPr>
+      <w:r>
+        <w:rPr>
+          <w:rFonts w:ascii="Consolas" w:hAnsi="Consolas" w:cs="Consolas"/>
+          <w:sz w:val="17"/>
+          <w:szCs w:val="17"/>
+        </w:rPr>
+        <w:t xml:space="preserve">        coef, *_ = np.linalg.lstsq(A, y, rcond=None)</w:t>
+      </w:r>
+    </w:p>
+    <w:p>
+      <w:pPr>
+        <w:rPr>
+          <w:rFonts w:ascii="Consolas" w:hAnsi="Consolas" w:cs="Consolas"/>
+          <w:sz w:val="17"/>
+          <w:szCs w:val="17"/>
+        </w:rPr>
+      </w:pPr>
+      <w:r>
+        <w:rPr>
+          <w:rFonts w:ascii="Consolas" w:hAnsi="Consolas" w:cs="Consolas"/>
+          <w:sz w:val="17"/>
+          <w:szCs w:val="17"/>
+        </w:rPr>
+        <w:t xml:space="preserve">        a, b = coef</w:t>
+      </w:r>
+    </w:p>
+    <w:p>
+      <w:pPr>
+        <w:rPr>
+          <w:rFonts w:ascii="Consolas" w:hAnsi="Consolas" w:cs="Consolas"/>
+          <w:sz w:val="17"/>
+          <w:szCs w:val="17"/>
+        </w:rPr>
+      </w:pPr>
+      <w:r>
+        <w:rPr>
+          <w:rFonts w:ascii="Consolas" w:hAnsi="Consolas" w:cs="Consolas"/>
+          <w:sz w:val="17"/>
+          <w:szCs w:val="17"/>
+        </w:rPr>
+        <w:t xml:space="preserve">        alpha[int(ell)] = float(a); beta[int(ell)] = float(b)</w:t>
+      </w:r>
+    </w:p>
+    <w:p>
+      <w:pPr>
+        <w:rPr>
+          <w:rFonts w:ascii="Consolas" w:hAnsi="Consolas" w:cs="Consolas"/>
+          <w:sz w:val="17"/>
+          <w:szCs w:val="17"/>
+        </w:rPr>
+      </w:pPr>
+      <w:r>
+        <w:rPr>
+          <w:rFonts w:ascii="Consolas" w:hAnsi="Consolas" w:cs="Consolas"/>
+          <w:sz w:val="17"/>
+          <w:szCs w:val="17"/>
+        </w:rPr>
+        <w:t xml:space="preserve">        Y_pred[m] = a * V[m] + b * (-G[m])</w:t>
+      </w:r>
+    </w:p>
+    <w:p>
+      <w:pPr>
+        <w:rPr>
+          <w:rFonts w:ascii="Consolas" w:hAnsi="Consolas" w:cs="Consolas"/>
+          <w:sz w:val="17"/>
+          <w:szCs w:val="17"/>
+        </w:rPr>
+      </w:pPr>
+      <w:r>
+        <w:rPr>
+          <w:rFonts w:ascii="Consolas" w:hAnsi="Consolas" w:cs="Consolas"/>
+          <w:sz w:val="17"/>
+          <w:szCs w:val="17"/>
+        </w:rPr>
+        <w:t xml:space="preserve">    return Y_pred, alpha, beta</w:t>
       </w:r>
     </w:p>
     <w:sectPr>
@@ -1406,7 +2254,6 @@
     <w:next w:val="Normal"/>
     <w:link w:val="Heading2Char"/>
     <w:uiPriority w:val="9"/>
-    <w:semiHidden/>
     <w:unhideWhenUsed/>
     <w:qFormat/>
     <w:rsid w:val="00F05F79"/>
@@ -1620,7 +2467,6 @@
     <w:basedOn w:val="DefaultParagraphFont"/>
     <w:link w:val="Heading2"/>
     <w:uiPriority w:val="9"/>
-    <w:semiHidden/>
     <w:rsid w:val="00F05F79"/>
     <w:rPr>
       <w:rFonts w:ascii="Calibri Light" w:eastAsiaTheme="majorEastAsia" w:hAnsi="Calibri Light" w:cstheme="majorBidi"/>

</xml_diff>

<commit_message>
update Deep Dive doc
</commit_message>
<xml_diff>
--- a/docs/splm/Deep_Dive_in_the_SPLM_model_and_code.docx
+++ b/docs/splm/Deep_Dive_in_the_SPLM_model_and_code.docx
@@ -77,7 +77,7 @@
             </w:rPr>
             <w:fldChar w:fldCharType="separate"/>
           </w:r>
-          <w:hyperlink w:anchor="_Toc230730754" w:history="1">
+          <w:hyperlink w:anchor="_Toc230812184" w:history="1">
             <w:r>
               <w:rPr>
                 <w:rStyle w:val="Hyperlink"/>
@@ -104,7 +104,7 @@
                 <w:noProof/>
                 <w:webHidden/>
               </w:rPr>
-              <w:instrText xml:space="preserve"> PAGEREF _Toc230730754 \h </w:instrText>
+              <w:instrText xml:space="preserve"> PAGEREF _Toc230812184 \h </w:instrText>
             </w:r>
             <w:r>
               <w:rPr>
@@ -150,7 +150,7 @@
               <w:szCs w:val="24"/>
             </w:rPr>
           </w:pPr>
-          <w:hyperlink w:anchor="_Toc230730755" w:history="1">
+          <w:hyperlink w:anchor="_Toc230812185" w:history="1">
             <w:r>
               <w:rPr>
                 <w:rStyle w:val="Hyperlink"/>
@@ -177,7 +177,7 @@
                 <w:noProof/>
                 <w:webHidden/>
               </w:rPr>
-              <w:instrText xml:space="preserve"> PAGEREF _Toc230730755 \h </w:instrText>
+              <w:instrText xml:space="preserve"> PAGEREF _Toc230812185 \h </w:instrText>
             </w:r>
             <w:r>
               <w:rPr>
@@ -221,7 +221,7 @@
               <w:szCs w:val="24"/>
             </w:rPr>
           </w:pPr>
-          <w:hyperlink w:anchor="_Toc230730756" w:history="1">
+          <w:hyperlink w:anchor="_Toc230812186" w:history="1">
             <w:r>
               <w:rPr>
                 <w:rStyle w:val="Hyperlink"/>
@@ -248,7 +248,7 @@
                 <w:noProof/>
                 <w:webHidden/>
               </w:rPr>
-              <w:instrText xml:space="preserve"> PAGEREF _Toc230730756 \h </w:instrText>
+              <w:instrText xml:space="preserve"> PAGEREF _Toc230812186 \h </w:instrText>
             </w:r>
             <w:r>
               <w:rPr>
@@ -292,7 +292,7 @@
               <w:szCs w:val="24"/>
             </w:rPr>
           </w:pPr>
-          <w:hyperlink w:anchor="_Toc230730757" w:history="1">
+          <w:hyperlink w:anchor="_Toc230812187" w:history="1">
             <w:r>
               <w:rPr>
                 <w:rStyle w:val="Hyperlink"/>
@@ -319,7 +319,7 @@
                 <w:noProof/>
                 <w:webHidden/>
               </w:rPr>
-              <w:instrText xml:space="preserve"> PAGEREF _Toc230730757 \h </w:instrText>
+              <w:instrText xml:space="preserve"> PAGEREF _Toc230812187 \h </w:instrText>
             </w:r>
             <w:r>
               <w:rPr>
@@ -363,7 +363,7 @@
               <w:szCs w:val="24"/>
             </w:rPr>
           </w:pPr>
-          <w:hyperlink w:anchor="_Toc230730758" w:history="1">
+          <w:hyperlink w:anchor="_Toc230812188" w:history="1">
             <w:r>
               <w:rPr>
                 <w:rStyle w:val="Hyperlink"/>
@@ -390,7 +390,7 @@
                 <w:noProof/>
                 <w:webHidden/>
               </w:rPr>
-              <w:instrText xml:space="preserve"> PAGEREF _Toc230730758 \h </w:instrText>
+              <w:instrText xml:space="preserve"> PAGEREF _Toc230812188 \h </w:instrText>
             </w:r>
             <w:r>
               <w:rPr>
@@ -410,7 +410,291 @@
                 <w:noProof/>
                 <w:webHidden/>
               </w:rPr>
-              <w:t>2</w:t>
+              <w:t>3</w:t>
+            </w:r>
+            <w:r>
+              <w:rPr>
+                <w:noProof/>
+                <w:webHidden/>
+              </w:rPr>
+              <w:fldChar w:fldCharType="end"/>
+            </w:r>
+          </w:hyperlink>
+        </w:p>
+        <w:p>
+          <w:pPr>
+            <w:pStyle w:val="TOC3"/>
+            <w:tabs>
+              <w:tab w:val="right" w:leader="dot" w:pos="9350"/>
+            </w:tabs>
+            <w:rPr>
+              <w:rFonts w:eastAsiaTheme="minorEastAsia"/>
+              <w:noProof/>
+              <w:sz w:val="24"/>
+              <w:szCs w:val="24"/>
+            </w:rPr>
+          </w:pPr>
+          <w:hyperlink w:anchor="_Toc230812189" w:history="1">
+            <w:r>
+              <w:rPr>
+                <w:rStyle w:val="Hyperlink"/>
+                <w:noProof/>
+              </w:rPr>
+              <w:t>Derived / Intermediate Quantities</w:t>
+            </w:r>
+            <w:r>
+              <w:rPr>
+                <w:noProof/>
+                <w:webHidden/>
+              </w:rPr>
+              <w:tab/>
+            </w:r>
+            <w:r>
+              <w:rPr>
+                <w:noProof/>
+                <w:webHidden/>
+              </w:rPr>
+              <w:fldChar w:fldCharType="begin"/>
+            </w:r>
+            <w:r>
+              <w:rPr>
+                <w:noProof/>
+                <w:webHidden/>
+              </w:rPr>
+              <w:instrText xml:space="preserve"> PAGEREF _Toc230812189 \h </w:instrText>
+            </w:r>
+            <w:r>
+              <w:rPr>
+                <w:noProof/>
+                <w:webHidden/>
+              </w:rPr>
+            </w:r>
+            <w:r>
+              <w:rPr>
+                <w:noProof/>
+                <w:webHidden/>
+              </w:rPr>
+              <w:fldChar w:fldCharType="separate"/>
+            </w:r>
+            <w:r>
+              <w:rPr>
+                <w:noProof/>
+                <w:webHidden/>
+              </w:rPr>
+              <w:t>3</w:t>
+            </w:r>
+            <w:r>
+              <w:rPr>
+                <w:noProof/>
+                <w:webHidden/>
+              </w:rPr>
+              <w:fldChar w:fldCharType="end"/>
+            </w:r>
+          </w:hyperlink>
+        </w:p>
+        <w:p>
+          <w:pPr>
+            <w:pStyle w:val="TOC3"/>
+            <w:tabs>
+              <w:tab w:val="right" w:leader="dot" w:pos="9350"/>
+            </w:tabs>
+            <w:rPr>
+              <w:rFonts w:eastAsiaTheme="minorEastAsia"/>
+              <w:noProof/>
+              <w:sz w:val="24"/>
+              <w:szCs w:val="24"/>
+            </w:rPr>
+          </w:pPr>
+          <w:hyperlink w:anchor="_Toc230812190" w:history="1">
+            <w:r>
+              <w:rPr>
+                <w:rStyle w:val="Hyperlink"/>
+                <w:noProof/>
+              </w:rPr>
+              <w:t>Loss and Training Quantities</w:t>
+            </w:r>
+            <w:r>
+              <w:rPr>
+                <w:noProof/>
+                <w:webHidden/>
+              </w:rPr>
+              <w:tab/>
+            </w:r>
+            <w:r>
+              <w:rPr>
+                <w:noProof/>
+                <w:webHidden/>
+              </w:rPr>
+              <w:fldChar w:fldCharType="begin"/>
+            </w:r>
+            <w:r>
+              <w:rPr>
+                <w:noProof/>
+                <w:webHidden/>
+              </w:rPr>
+              <w:instrText xml:space="preserve"> PAGEREF _Toc230812190 \h </w:instrText>
+            </w:r>
+            <w:r>
+              <w:rPr>
+                <w:noProof/>
+                <w:webHidden/>
+              </w:rPr>
+            </w:r>
+            <w:r>
+              <w:rPr>
+                <w:noProof/>
+                <w:webHidden/>
+              </w:rPr>
+              <w:fldChar w:fldCharType="separate"/>
+            </w:r>
+            <w:r>
+              <w:rPr>
+                <w:noProof/>
+                <w:webHidden/>
+              </w:rPr>
+              <w:t>4</w:t>
+            </w:r>
+            <w:r>
+              <w:rPr>
+                <w:noProof/>
+                <w:webHidden/>
+              </w:rPr>
+              <w:fldChar w:fldCharType="end"/>
+            </w:r>
+          </w:hyperlink>
+        </w:p>
+        <w:p>
+          <w:pPr>
+            <w:pStyle w:val="TOC3"/>
+            <w:tabs>
+              <w:tab w:val="right" w:leader="dot" w:pos="9350"/>
+            </w:tabs>
+            <w:rPr>
+              <w:rFonts w:eastAsiaTheme="minorEastAsia"/>
+              <w:noProof/>
+              <w:sz w:val="24"/>
+              <w:szCs w:val="24"/>
+            </w:rPr>
+          </w:pPr>
+          <w:hyperlink w:anchor="_Toc230812191" w:history="1">
+            <w:r>
+              <w:rPr>
+                <w:rStyle w:val="Hyperlink"/>
+                <w:noProof/>
+              </w:rPr>
+              <w:t>Oracle-Fit Quantities</w:t>
+            </w:r>
+            <w:r>
+              <w:rPr>
+                <w:noProof/>
+                <w:webHidden/>
+              </w:rPr>
+              <w:tab/>
+            </w:r>
+            <w:r>
+              <w:rPr>
+                <w:noProof/>
+                <w:webHidden/>
+              </w:rPr>
+              <w:fldChar w:fldCharType="begin"/>
+            </w:r>
+            <w:r>
+              <w:rPr>
+                <w:noProof/>
+                <w:webHidden/>
+              </w:rPr>
+              <w:instrText xml:space="preserve"> PAGEREF _Toc230812191 \h </w:instrText>
+            </w:r>
+            <w:r>
+              <w:rPr>
+                <w:noProof/>
+                <w:webHidden/>
+              </w:rPr>
+            </w:r>
+            <w:r>
+              <w:rPr>
+                <w:noProof/>
+                <w:webHidden/>
+              </w:rPr>
+              <w:fldChar w:fldCharType="separate"/>
+            </w:r>
+            <w:r>
+              <w:rPr>
+                <w:noProof/>
+                <w:webHidden/>
+              </w:rPr>
+              <w:t>4</w:t>
+            </w:r>
+            <w:r>
+              <w:rPr>
+                <w:noProof/>
+                <w:webHidden/>
+              </w:rPr>
+              <w:fldChar w:fldCharType="end"/>
+            </w:r>
+          </w:hyperlink>
+        </w:p>
+        <w:p>
+          <w:pPr>
+            <w:pStyle w:val="TOC3"/>
+            <w:tabs>
+              <w:tab w:val="right" w:leader="dot" w:pos="9350"/>
+            </w:tabs>
+            <w:rPr>
+              <w:rFonts w:eastAsiaTheme="minorEastAsia"/>
+              <w:noProof/>
+              <w:sz w:val="24"/>
+              <w:szCs w:val="24"/>
+            </w:rPr>
+          </w:pPr>
+          <w:hyperlink w:anchor="_Toc230812192" w:history="1">
+            <w:r>
+              <w:rPr>
+                <w:rStyle w:val="Hyperlink"/>
+                <w:noProof/>
+              </w:rPr>
+              <w:t>Architectural Principles</w:t>
+            </w:r>
+            <w:r>
+              <w:rPr>
+                <w:noProof/>
+                <w:webHidden/>
+              </w:rPr>
+              <w:tab/>
+            </w:r>
+            <w:r>
+              <w:rPr>
+                <w:noProof/>
+                <w:webHidden/>
+              </w:rPr>
+              <w:fldChar w:fldCharType="begin"/>
+            </w:r>
+            <w:r>
+              <w:rPr>
+                <w:noProof/>
+                <w:webHidden/>
+              </w:rPr>
+              <w:instrText xml:space="preserve"> PAGEREF _Toc230812192 \h </w:instrText>
+            </w:r>
+            <w:r>
+              <w:rPr>
+                <w:noProof/>
+                <w:webHidden/>
+              </w:rPr>
+            </w:r>
+            <w:r>
+              <w:rPr>
+                <w:noProof/>
+                <w:webHidden/>
+              </w:rPr>
+              <w:fldChar w:fldCharType="separate"/>
+            </w:r>
+            <w:r>
+              <w:rPr>
+                <w:noProof/>
+                <w:webHidden/>
+              </w:rPr>
+              <w:t>5</w:t>
             </w:r>
             <w:r>
               <w:rPr>
@@ -436,7 +720,7 @@
               <w:szCs w:val="24"/>
             </w:rPr>
           </w:pPr>
-          <w:hyperlink w:anchor="_Toc230730759" w:history="1">
+          <w:hyperlink w:anchor="_Toc230812193" w:history="1">
             <w:r>
               <w:rPr>
                 <w:rStyle w:val="Hyperlink"/>
@@ -463,7 +747,7 @@
                 <w:noProof/>
                 <w:webHidden/>
               </w:rPr>
-              <w:instrText xml:space="preserve"> PAGEREF _Toc230730759 \h </w:instrText>
+              <w:instrText xml:space="preserve"> PAGEREF _Toc230812193 \h </w:instrText>
             </w:r>
             <w:r>
               <w:rPr>
@@ -483,7 +767,7 @@
                 <w:noProof/>
                 <w:webHidden/>
               </w:rPr>
-              <w:t>5</w:t>
+              <w:t>7</w:t>
             </w:r>
             <w:r>
               <w:rPr>
@@ -509,7 +793,7 @@
               <w:szCs w:val="24"/>
             </w:rPr>
           </w:pPr>
-          <w:hyperlink w:anchor="_Toc230730760" w:history="1">
+          <w:hyperlink w:anchor="_Toc230812194" w:history="1">
             <w:r>
               <w:rPr>
                 <w:rStyle w:val="Hyperlink"/>
@@ -536,7 +820,7 @@
                 <w:noProof/>
                 <w:webHidden/>
               </w:rPr>
-              <w:instrText xml:space="preserve"> PAGEREF _Toc230730760 \h </w:instrText>
+              <w:instrText xml:space="preserve"> PAGEREF _Toc230812194 \h </w:instrText>
             </w:r>
             <w:r>
               <w:rPr>
@@ -556,7 +840,7 @@
                 <w:noProof/>
                 <w:webHidden/>
               </w:rPr>
-              <w:t>5</w:t>
+              <w:t>7</w:t>
             </w:r>
             <w:r>
               <w:rPr>
@@ -583,7 +867,7 @@
               <w:sz w:val="24"/>
             </w:rPr>
           </w:pPr>
-          <w:hyperlink w:anchor="_Toc230730761" w:history="1">
+          <w:hyperlink w:anchor="_Toc230812195" w:history="1">
             <w:r>
               <w:rPr>
                 <w:rStyle w:val="Hyperlink"/>
@@ -610,7 +894,7 @@
                 <w:noProof/>
                 <w:webHidden/>
               </w:rPr>
-              <w:instrText xml:space="preserve"> PAGEREF _Toc230730761 \h </w:instrText>
+              <w:instrText xml:space="preserve"> PAGEREF _Toc230812195 \h </w:instrText>
             </w:r>
             <w:r>
               <w:rPr>
@@ -630,7 +914,7 @@
                 <w:noProof/>
                 <w:webHidden/>
               </w:rPr>
-              <w:t>5</w:t>
+              <w:t>8</w:t>
             </w:r>
             <w:r>
               <w:rPr>
@@ -657,7 +941,7 @@
               <w:sz w:val="24"/>
             </w:rPr>
           </w:pPr>
-          <w:hyperlink w:anchor="_Toc230730762" w:history="1">
+          <w:hyperlink w:anchor="_Toc230812196" w:history="1">
             <w:r>
               <w:rPr>
                 <w:rStyle w:val="Hyperlink"/>
@@ -684,7 +968,7 @@
                 <w:noProof/>
                 <w:webHidden/>
               </w:rPr>
-              <w:instrText xml:space="preserve"> PAGEREF _Toc230730762 \h </w:instrText>
+              <w:instrText xml:space="preserve"> PAGEREF _Toc230812196 \h </w:instrText>
             </w:r>
             <w:r>
               <w:rPr>
@@ -704,7 +988,7 @@
                 <w:noProof/>
                 <w:webHidden/>
               </w:rPr>
-              <w:t>5</w:t>
+              <w:t>8</w:t>
             </w:r>
             <w:r>
               <w:rPr>
@@ -730,7 +1014,7 @@
               <w:szCs w:val="24"/>
             </w:rPr>
           </w:pPr>
-          <w:hyperlink w:anchor="_Toc230730763" w:history="1">
+          <w:hyperlink w:anchor="_Toc230812197" w:history="1">
             <w:r>
               <w:rPr>
                 <w:rStyle w:val="Hyperlink"/>
@@ -765,7 +1049,7 @@
                 <w:noProof/>
                 <w:webHidden/>
               </w:rPr>
-              <w:instrText xml:space="preserve"> PAGEREF _Toc230730763 \h </w:instrText>
+              <w:instrText xml:space="preserve"> PAGEREF _Toc230812197 \h </w:instrText>
             </w:r>
             <w:r>
               <w:rPr>
@@ -785,7 +1069,7 @@
                 <w:noProof/>
                 <w:webHidden/>
               </w:rPr>
-              <w:t>5</w:t>
+              <w:t>8</w:t>
             </w:r>
             <w:r>
               <w:rPr>
@@ -809,7 +1093,7 @@
               <w:szCs w:val="24"/>
             </w:rPr>
           </w:pPr>
-          <w:hyperlink w:anchor="_Toc230730764" w:history="1">
+          <w:hyperlink w:anchor="_Toc230812198" w:history="1">
             <w:r>
               <w:rPr>
                 <w:rStyle w:val="Hyperlink"/>
@@ -844,7 +1128,7 @@
                 <w:noProof/>
                 <w:webHidden/>
               </w:rPr>
-              <w:instrText xml:space="preserve"> PAGEREF _Toc230730764 \h </w:instrText>
+              <w:instrText xml:space="preserve"> PAGEREF _Toc230812198 \h </w:instrText>
             </w:r>
             <w:r>
               <w:rPr>
@@ -864,7 +1148,7 @@
                 <w:noProof/>
                 <w:webHidden/>
               </w:rPr>
-              <w:t>6</w:t>
+              <w:t>8</w:t>
             </w:r>
             <w:r>
               <w:rPr>
@@ -888,7 +1172,7 @@
               <w:szCs w:val="24"/>
             </w:rPr>
           </w:pPr>
-          <w:hyperlink w:anchor="_Toc230730765" w:history="1">
+          <w:hyperlink w:anchor="_Toc230812199" w:history="1">
             <w:r>
               <w:rPr>
                 <w:rStyle w:val="Hyperlink"/>
@@ -923,7 +1207,7 @@
                 <w:noProof/>
                 <w:webHidden/>
               </w:rPr>
-              <w:instrText xml:space="preserve"> PAGEREF _Toc230730765 \h </w:instrText>
+              <w:instrText xml:space="preserve"> PAGEREF _Toc230812199 \h </w:instrText>
             </w:r>
             <w:r>
               <w:rPr>
@@ -943,7 +1227,7 @@
                 <w:noProof/>
                 <w:webHidden/>
               </w:rPr>
-              <w:t>6</w:t>
+              <w:t>9</w:t>
             </w:r>
             <w:r>
               <w:rPr>
@@ -969,7 +1253,7 @@
               <w:szCs w:val="24"/>
             </w:rPr>
           </w:pPr>
-          <w:hyperlink w:anchor="_Toc230730766" w:history="1">
+          <w:hyperlink w:anchor="_Toc230812200" w:history="1">
             <w:r>
               <w:rPr>
                 <w:rStyle w:val="Hyperlink"/>
@@ -1004,7 +1288,7 @@
                 <w:noProof/>
                 <w:webHidden/>
               </w:rPr>
-              <w:instrText xml:space="preserve"> PAGEREF _Toc230730766 \h </w:instrText>
+              <w:instrText xml:space="preserve"> PAGEREF _Toc230812200 \h </w:instrText>
             </w:r>
             <w:r>
               <w:rPr>
@@ -1024,7 +1308,7 @@
                 <w:noProof/>
                 <w:webHidden/>
               </w:rPr>
-              <w:t>8</w:t>
+              <w:t>11</w:t>
             </w:r>
             <w:r>
               <w:rPr>
@@ -1048,7 +1332,7 @@
               <w:szCs w:val="24"/>
             </w:rPr>
           </w:pPr>
-          <w:hyperlink w:anchor="_Toc230730767" w:history="1">
+          <w:hyperlink w:anchor="_Toc230812201" w:history="1">
             <w:r>
               <w:rPr>
                 <w:rStyle w:val="Hyperlink"/>
@@ -1083,7 +1367,7 @@
                 <w:noProof/>
                 <w:webHidden/>
               </w:rPr>
-              <w:instrText xml:space="preserve"> PAGEREF _Toc230730767 \h </w:instrText>
+              <w:instrText xml:space="preserve"> PAGEREF _Toc230812201 \h </w:instrText>
             </w:r>
             <w:r>
               <w:rPr>
@@ -1103,7 +1387,7 @@
                 <w:noProof/>
                 <w:webHidden/>
               </w:rPr>
-              <w:t>8</w:t>
+              <w:t>11</w:t>
             </w:r>
             <w:r>
               <w:rPr>
@@ -1127,7 +1411,7 @@
               <w:szCs w:val="24"/>
             </w:rPr>
           </w:pPr>
-          <w:hyperlink w:anchor="_Toc230730768" w:history="1">
+          <w:hyperlink w:anchor="_Toc230812202" w:history="1">
             <w:r>
               <w:rPr>
                 <w:rStyle w:val="Hyperlink"/>
@@ -1162,7 +1446,7 @@
                 <w:noProof/>
                 <w:webHidden/>
               </w:rPr>
-              <w:instrText xml:space="preserve"> PAGEREF _Toc230730768 \h </w:instrText>
+              <w:instrText xml:space="preserve"> PAGEREF _Toc230812202 \h </w:instrText>
             </w:r>
             <w:r>
               <w:rPr>
@@ -1182,7 +1466,7 @@
                 <w:noProof/>
                 <w:webHidden/>
               </w:rPr>
-              <w:t>9</w:t>
+              <w:t>11</w:t>
             </w:r>
             <w:r>
               <w:rPr>
@@ -1206,7 +1490,7 @@
               <w:szCs w:val="24"/>
             </w:rPr>
           </w:pPr>
-          <w:hyperlink w:anchor="_Toc230730769" w:history="1">
+          <w:hyperlink w:anchor="_Toc230812203" w:history="1">
             <w:r>
               <w:rPr>
                 <w:rStyle w:val="Hyperlink"/>
@@ -1241,7 +1525,7 @@
                 <w:noProof/>
                 <w:webHidden/>
               </w:rPr>
-              <w:instrText xml:space="preserve"> PAGEREF _Toc230730769 \h </w:instrText>
+              <w:instrText xml:space="preserve"> PAGEREF _Toc230812203 \h </w:instrText>
             </w:r>
             <w:r>
               <w:rPr>
@@ -1261,7 +1545,7 @@
                 <w:noProof/>
                 <w:webHidden/>
               </w:rPr>
-              <w:t>9</w:t>
+              <w:t>12</w:t>
             </w:r>
             <w:r>
               <w:rPr>
@@ -1287,7 +1571,7 @@
               <w:szCs w:val="24"/>
             </w:rPr>
           </w:pPr>
-          <w:hyperlink w:anchor="_Toc230730770" w:history="1">
+          <w:hyperlink w:anchor="_Toc230812204" w:history="1">
             <w:r>
               <w:rPr>
                 <w:rStyle w:val="Hyperlink"/>
@@ -1322,7 +1606,7 @@
                 <w:noProof/>
                 <w:webHidden/>
               </w:rPr>
-              <w:instrText xml:space="preserve"> PAGEREF _Toc230730770 \h </w:instrText>
+              <w:instrText xml:space="preserve"> PAGEREF _Toc230812204 \h </w:instrText>
             </w:r>
             <w:r>
               <w:rPr>
@@ -1342,7 +1626,7 @@
                 <w:noProof/>
                 <w:webHidden/>
               </w:rPr>
-              <w:t>12</w:t>
+              <w:t>14</w:t>
             </w:r>
             <w:r>
               <w:rPr>
@@ -1366,7 +1650,7 @@
               <w:szCs w:val="24"/>
             </w:rPr>
           </w:pPr>
-          <w:hyperlink w:anchor="_Toc230730771" w:history="1">
+          <w:hyperlink w:anchor="_Toc230812205" w:history="1">
             <w:r>
               <w:rPr>
                 <w:rStyle w:val="Hyperlink"/>
@@ -1401,7 +1685,7 @@
                 <w:noProof/>
                 <w:webHidden/>
               </w:rPr>
-              <w:instrText xml:space="preserve"> PAGEREF _Toc230730771 \h </w:instrText>
+              <w:instrText xml:space="preserve"> PAGEREF _Toc230812205 \h </w:instrText>
             </w:r>
             <w:r>
               <w:rPr>
@@ -1421,7 +1705,7 @@
                 <w:noProof/>
                 <w:webHidden/>
               </w:rPr>
-              <w:t>12</w:t>
+              <w:t>14</w:t>
             </w:r>
             <w:r>
               <w:rPr>
@@ -1445,7 +1729,7 @@
               <w:szCs w:val="24"/>
             </w:rPr>
           </w:pPr>
-          <w:hyperlink w:anchor="_Toc230730772" w:history="1">
+          <w:hyperlink w:anchor="_Toc230812206" w:history="1">
             <w:r>
               <w:rPr>
                 <w:rStyle w:val="Hyperlink"/>
@@ -1480,7 +1764,7 @@
                 <w:noProof/>
                 <w:webHidden/>
               </w:rPr>
-              <w:instrText xml:space="preserve"> PAGEREF _Toc230730772 \h </w:instrText>
+              <w:instrText xml:space="preserve"> PAGEREF _Toc230812206 \h </w:instrText>
             </w:r>
             <w:r>
               <w:rPr>
@@ -1500,7 +1784,7 @@
                 <w:noProof/>
                 <w:webHidden/>
               </w:rPr>
-              <w:t>12</w:t>
+              <w:t>15</w:t>
             </w:r>
             <w:r>
               <w:rPr>
@@ -1524,7 +1808,7 @@
               <w:szCs w:val="24"/>
             </w:rPr>
           </w:pPr>
-          <w:hyperlink w:anchor="_Toc230730773" w:history="1">
+          <w:hyperlink w:anchor="_Toc230812207" w:history="1">
             <w:r>
               <w:rPr>
                 <w:rStyle w:val="Hyperlink"/>
@@ -1559,7 +1843,7 @@
                 <w:noProof/>
                 <w:webHidden/>
               </w:rPr>
-              <w:instrText xml:space="preserve"> PAGEREF _Toc230730773 \h </w:instrText>
+              <w:instrText xml:space="preserve"> PAGEREF _Toc230812207 \h </w:instrText>
             </w:r>
             <w:r>
               <w:rPr>
@@ -1579,7 +1863,7 @@
                 <w:noProof/>
                 <w:webHidden/>
               </w:rPr>
-              <w:t>12</w:t>
+              <w:t>15</w:t>
             </w:r>
             <w:r>
               <w:rPr>
@@ -1605,7 +1889,7 @@
               <w:szCs w:val="24"/>
             </w:rPr>
           </w:pPr>
-          <w:hyperlink w:anchor="_Toc230730774" w:history="1">
+          <w:hyperlink w:anchor="_Toc230812208" w:history="1">
             <w:r>
               <w:rPr>
                 <w:rStyle w:val="Hyperlink"/>
@@ -1640,7 +1924,7 @@
                 <w:noProof/>
                 <w:webHidden/>
               </w:rPr>
-              <w:instrText xml:space="preserve"> PAGEREF _Toc230730774 \h </w:instrText>
+              <w:instrText xml:space="preserve"> PAGEREF _Toc230812208 \h </w:instrText>
             </w:r>
             <w:r>
               <w:rPr>
@@ -1660,7 +1944,7 @@
                 <w:noProof/>
                 <w:webHidden/>
               </w:rPr>
-              <w:t>17</w:t>
+              <w:t>20</w:t>
             </w:r>
             <w:r>
               <w:rPr>
@@ -1686,7 +1970,7 @@
               <w:szCs w:val="24"/>
             </w:rPr>
           </w:pPr>
-          <w:hyperlink w:anchor="_Toc230730775" w:history="1">
+          <w:hyperlink w:anchor="_Toc230812209" w:history="1">
             <w:r>
               <w:rPr>
                 <w:rStyle w:val="Hyperlink"/>
@@ -1721,7 +2005,7 @@
                 <w:noProof/>
                 <w:webHidden/>
               </w:rPr>
-              <w:instrText xml:space="preserve"> PAGEREF _Toc230730775 \h </w:instrText>
+              <w:instrText xml:space="preserve"> PAGEREF _Toc230812209 \h </w:instrText>
             </w:r>
             <w:r>
               <w:rPr>
@@ -1741,7 +2025,7 @@
                 <w:noProof/>
                 <w:webHidden/>
               </w:rPr>
-              <w:t>17</w:t>
+              <w:t>20</w:t>
             </w:r>
             <w:r>
               <w:rPr>
@@ -1770,7 +2054,7 @@
       <w:pPr>
         <w:pStyle w:val="Heading1"/>
       </w:pPr>
-      <w:bookmarkStart w:id="0" w:name="_Toc230730754"/>
+      <w:bookmarkStart w:id="0" w:name="_Toc230812184"/>
       <w:r>
         <w:t>Reference Vanilla Architecture</w:t>
       </w:r>
@@ -1787,7 +2071,7 @@
       <w:pPr>
         <w:pStyle w:val="Heading2"/>
       </w:pPr>
-      <w:bookmarkStart w:id="1" w:name="_Toc230730755"/>
+      <w:bookmarkStart w:id="1" w:name="_Toc230812185"/>
       <w:r>
         <w:t>Notation and Introductory Notes</w:t>
       </w:r>
@@ -1798,7 +2082,7 @@
       <w:pPr>
         <w:pStyle w:val="Heading3"/>
       </w:pPr>
-      <w:bookmarkStart w:id="2" w:name="_Toc230730756"/>
+      <w:bookmarkStart w:id="2" w:name="_Toc230812186"/>
       <w:r>
         <w:t>Architecture Hyperparameters</w:t>
       </w:r>
@@ -1914,6 +2198,7 @@
           <w:rPr>
             <w:rFonts w:ascii="Cambria Math" w:hAnsi="Cambria Math"/>
           </w:rPr>
+          <w:lastRenderedPageBreak/>
           <m:t>T</m:t>
         </m:r>
       </m:oMath>
@@ -2004,7 +2289,6 @@
           <w:rPr>
             <w:rFonts w:ascii="Cambria Math" w:eastAsiaTheme="minorEastAsia" w:hAnsi="Cambria Math"/>
           </w:rPr>
-          <w:lastRenderedPageBreak/>
           <m:t>L</m:t>
         </m:r>
       </m:oMath>
@@ -2427,7 +2711,7 @@
       <w:pPr>
         <w:pStyle w:val="Heading3"/>
       </w:pPr>
-      <w:bookmarkStart w:id="3" w:name="_Toc230730757"/>
+      <w:bookmarkStart w:id="3" w:name="_Toc230812187"/>
       <w:r>
         <w:t>State Variables</w:t>
       </w:r>
@@ -5127,7 +5411,7 @@
           <w:rFonts w:eastAsiaTheme="minorEastAsia"/>
         </w:rPr>
       </w:pPr>
-      <w:bookmarkStart w:id="4" w:name="_Toc230730758"/>
+      <w:bookmarkStart w:id="4" w:name="_Toc230812188"/>
       <w:r>
         <w:rPr>
           <w:rFonts w:eastAsiaTheme="minorEastAsia"/>
@@ -5143,7 +5427,6 @@
           <w:rPr>
             <w:rFonts w:ascii="Cambria Math" w:hAnsi="Cambria Math"/>
           </w:rPr>
-          <w:lastRenderedPageBreak/>
           <m:t>E</m:t>
         </m:r>
       </m:oMath>
@@ -7289,9 +7572,11 @@
       <w:pPr>
         <w:pStyle w:val="Heading3"/>
       </w:pPr>
+      <w:bookmarkStart w:id="5" w:name="_Toc230812189"/>
       <w:r>
         <w:t>Derived / Intermediate Quantities</w:t>
       </w:r>
+      <w:bookmarkEnd w:id="5"/>
     </w:p>
     <w:p/>
     <w:p>
@@ -8405,10 +8690,11 @@
       <w:pPr>
         <w:pStyle w:val="Heading3"/>
       </w:pPr>
-      <w:r>
-        <w:lastRenderedPageBreak/>
+      <w:bookmarkStart w:id="6" w:name="_Toc230812190"/>
+      <w:r>
         <w:t>Loss and Training Quantities</w:t>
       </w:r>
+      <w:bookmarkEnd w:id="6"/>
     </w:p>
     <w:p/>
     <w:p>
@@ -8836,11 +9122,19 @@
           <w:rFonts w:eastAsiaTheme="minorEastAsia"/>
         </w:rPr>
       </w:pPr>
-      <w:r>
-        <w:rPr>
-          <w:rFonts w:eastAsiaTheme="minorEastAsia"/>
-        </w:rPr>
-        <w:t xml:space="preserve">Oracle-Fit Quantities </w:t>
+      <w:bookmarkStart w:id="7" w:name="_Toc230812191"/>
+      <w:r>
+        <w:rPr>
+          <w:rFonts w:eastAsiaTheme="minorEastAsia"/>
+        </w:rPr>
+        <w:t>Oracle-Fit Quantities</w:t>
+      </w:r>
+      <w:bookmarkEnd w:id="7"/>
+      <w:r>
+        <w:rPr>
+          <w:rFonts w:eastAsiaTheme="minorEastAsia"/>
+        </w:rPr>
+        <w:t xml:space="preserve"> </w:t>
       </w:r>
     </w:p>
     <w:p/>
@@ -8887,6 +9181,1860 @@
         </w:rPr>
         <w:t xml:space="preserve"> - per-layer scalar coefficient on </w:t>
       </w:r>
+      <m:oMath>
+        <m:sSub>
+          <m:sSubPr>
+            <m:ctrlPr>
+              <w:rPr>
+                <w:rFonts w:ascii="Cambria Math" w:eastAsiaTheme="minorEastAsia" w:hAnsi="Cambria Math"/>
+                <w:i/>
+              </w:rPr>
+            </m:ctrlPr>
+          </m:sSubPr>
+          <m:e>
+            <m:r>
+              <w:rPr>
+                <w:rFonts w:ascii="Cambria Math" w:eastAsiaTheme="minorEastAsia" w:hAnsi="Cambria Math"/>
+              </w:rPr>
+              <m:t>V</m:t>
+            </m:r>
+          </m:e>
+          <m:sub>
+            <m:r>
+              <w:rPr>
+                <w:rFonts w:ascii="Cambria Math" w:hAnsi="Cambria Math"/>
+              </w:rPr>
+              <m:t>θ</m:t>
+            </m:r>
+          </m:sub>
+        </m:sSub>
+      </m:oMath>
+      <w:r>
+        <w:rPr>
+          <w:rFonts w:eastAsiaTheme="minorEastAsia"/>
+        </w:rPr>
+        <w:t xml:space="preserve"> in the oracle regression: </w:t>
+      </w:r>
+      <m:oMath>
+        <m:r>
+          <w:rPr>
+            <w:rFonts w:ascii="Cambria Math" w:eastAsiaTheme="minorEastAsia" w:hAnsi="Cambria Math"/>
+          </w:rPr>
+          <m:t>∆</m:t>
+        </m:r>
+        <m:sSub>
+          <m:sSubPr>
+            <m:ctrlPr>
+              <w:rPr>
+                <w:rFonts w:ascii="Cambria Math" w:eastAsiaTheme="minorEastAsia" w:hAnsi="Cambria Math"/>
+                <w:i/>
+              </w:rPr>
+            </m:ctrlPr>
+          </m:sSubPr>
+          <m:e>
+            <m:r>
+              <w:rPr>
+                <w:rFonts w:ascii="Cambria Math" w:eastAsiaTheme="minorEastAsia" w:hAnsi="Cambria Math"/>
+              </w:rPr>
+              <m:t>h</m:t>
+            </m:r>
+          </m:e>
+          <m:sub>
+            <m:r>
+              <m:rPr>
+                <m:scr m:val="script"/>
+              </m:rPr>
+              <w:rPr>
+                <w:rFonts w:ascii="Cambria Math" w:eastAsiaTheme="minorEastAsia" w:hAnsi="Cambria Math"/>
+              </w:rPr>
+              <m:t>l</m:t>
+            </m:r>
+          </m:sub>
+        </m:sSub>
+        <m:r>
+          <w:rPr>
+            <w:rFonts w:ascii="Cambria Math" w:eastAsiaTheme="minorEastAsia" w:hAnsi="Cambria Math"/>
+          </w:rPr>
+          <m:t xml:space="preserve"> ~ </m:t>
+        </m:r>
+        <m:sSub>
+          <m:sSubPr>
+            <m:ctrlPr>
+              <w:rPr>
+                <w:rFonts w:ascii="Cambria Math" w:eastAsiaTheme="minorEastAsia" w:hAnsi="Cambria Math"/>
+                <w:i/>
+              </w:rPr>
+            </m:ctrlPr>
+          </m:sSubPr>
+          <m:e>
+            <m:r>
+              <w:rPr>
+                <w:rFonts w:ascii="Cambria Math" w:eastAsiaTheme="minorEastAsia" w:hAnsi="Cambria Math"/>
+              </w:rPr>
+              <m:t>α</m:t>
+            </m:r>
+          </m:e>
+          <m:sub>
+            <m:r>
+              <m:rPr>
+                <m:scr m:val="script"/>
+              </m:rPr>
+              <w:rPr>
+                <w:rFonts w:ascii="Cambria Math" w:eastAsiaTheme="minorEastAsia" w:hAnsi="Cambria Math"/>
+              </w:rPr>
+              <m:t>l</m:t>
+            </m:r>
+          </m:sub>
+        </m:sSub>
+        <m:sSub>
+          <m:sSubPr>
+            <m:ctrlPr>
+              <w:rPr>
+                <w:rFonts w:ascii="Cambria Math" w:eastAsiaTheme="minorEastAsia" w:hAnsi="Cambria Math"/>
+                <w:i/>
+              </w:rPr>
+            </m:ctrlPr>
+          </m:sSubPr>
+          <m:e>
+            <m:r>
+              <w:rPr>
+                <w:rFonts w:ascii="Cambria Math" w:eastAsiaTheme="minorEastAsia" w:hAnsi="Cambria Math"/>
+              </w:rPr>
+              <m:t>V</m:t>
+            </m:r>
+          </m:e>
+          <m:sub>
+            <m:r>
+              <w:rPr>
+                <w:rFonts w:ascii="Cambria Math" w:hAnsi="Cambria Math"/>
+              </w:rPr>
+              <m:t>θ</m:t>
+            </m:r>
+          </m:sub>
+        </m:sSub>
+        <m:d>
+          <m:dPr>
+            <m:ctrlPr>
+              <w:rPr>
+                <w:rFonts w:ascii="Cambria Math" w:hAnsi="Cambria Math"/>
+                <w:i/>
+              </w:rPr>
+            </m:ctrlPr>
+          </m:dPr>
+          <m:e>
+            <m:r>
+              <w:rPr>
+                <w:rFonts w:ascii="Cambria Math" w:hAnsi="Cambria Math"/>
+              </w:rPr>
+              <m:t>ξ,</m:t>
+            </m:r>
+            <m:sSub>
+              <m:sSubPr>
+                <m:ctrlPr>
+                  <w:rPr>
+                    <w:rFonts w:ascii="Cambria Math" w:eastAsiaTheme="minorEastAsia" w:hAnsi="Cambria Math"/>
+                    <w:i/>
+                  </w:rPr>
+                </m:ctrlPr>
+              </m:sSubPr>
+              <m:e>
+                <m:r>
+                  <w:rPr>
+                    <w:rFonts w:ascii="Cambria Math" w:eastAsiaTheme="minorEastAsia" w:hAnsi="Cambria Math"/>
+                  </w:rPr>
+                  <m:t>h</m:t>
+                </m:r>
+              </m:e>
+              <m:sub>
+                <m:r>
+                  <m:rPr>
+                    <m:scr m:val="script"/>
+                  </m:rPr>
+                  <w:rPr>
+                    <w:rFonts w:ascii="Cambria Math" w:eastAsiaTheme="minorEastAsia" w:hAnsi="Cambria Math"/>
+                  </w:rPr>
+                  <m:t>l</m:t>
+                </m:r>
+              </m:sub>
+            </m:sSub>
+          </m:e>
+        </m:d>
+        <m:r>
+          <w:rPr>
+            <w:rFonts w:ascii="Cambria Math" w:eastAsiaTheme="minorEastAsia" w:hAnsi="Cambria Math"/>
+          </w:rPr>
+          <m:t>+</m:t>
+        </m:r>
+        <m:sSub>
+          <m:sSubPr>
+            <m:ctrlPr>
+              <w:rPr>
+                <w:rFonts w:ascii="Cambria Math" w:eastAsiaTheme="minorEastAsia" w:hAnsi="Cambria Math"/>
+                <w:i/>
+              </w:rPr>
+            </m:ctrlPr>
+          </m:sSubPr>
+          <m:e>
+            <m:r>
+              <w:rPr>
+                <w:rFonts w:ascii="Cambria Math" w:eastAsiaTheme="minorEastAsia" w:hAnsi="Cambria Math"/>
+              </w:rPr>
+              <m:t>β</m:t>
+            </m:r>
+          </m:e>
+          <m:sub>
+            <m:r>
+              <m:rPr>
+                <m:scr m:val="script"/>
+              </m:rPr>
+              <w:rPr>
+                <w:rFonts w:ascii="Cambria Math" w:eastAsiaTheme="minorEastAsia" w:hAnsi="Cambria Math"/>
+              </w:rPr>
+              <m:t>l</m:t>
+            </m:r>
+          </m:sub>
+        </m:sSub>
+        <m:d>
+          <m:dPr>
+            <m:ctrlPr>
+              <w:rPr>
+                <w:rFonts w:ascii="Cambria Math" w:eastAsiaTheme="minorEastAsia" w:hAnsi="Cambria Math"/>
+                <w:i/>
+              </w:rPr>
+            </m:ctrlPr>
+          </m:dPr>
+          <m:e>
+            <m:r>
+              <w:rPr>
+                <w:rFonts w:ascii="Cambria Math" w:eastAsiaTheme="minorEastAsia" w:hAnsi="Cambria Math"/>
+              </w:rPr>
+              <m:t>-</m:t>
+            </m:r>
+            <m:sSub>
+              <m:sSubPr>
+                <m:ctrlPr>
+                  <w:rPr>
+                    <w:rFonts w:ascii="Cambria Math" w:eastAsiaTheme="minorEastAsia" w:hAnsi="Cambria Math"/>
+                    <w:i/>
+                  </w:rPr>
+                </m:ctrlPr>
+              </m:sSubPr>
+              <m:e>
+                <m:r>
+                  <m:rPr>
+                    <m:sty m:val="p"/>
+                  </m:rPr>
+                  <w:rPr>
+                    <w:rFonts w:ascii="Cambria Math" w:eastAsiaTheme="minorEastAsia" w:hAnsi="Cambria Math"/>
+                  </w:rPr>
+                  <m:t>∇</m:t>
+                </m:r>
+              </m:e>
+              <m:sub>
+                <m:r>
+                  <w:rPr>
+                    <w:rFonts w:ascii="Cambria Math" w:eastAsiaTheme="minorEastAsia" w:hAnsi="Cambria Math"/>
+                  </w:rPr>
+                  <m:t>h</m:t>
+                </m:r>
+              </m:sub>
+            </m:sSub>
+            <m:sSub>
+              <m:sSubPr>
+                <m:ctrlPr>
+                  <w:rPr>
+                    <w:rFonts w:ascii="Cambria Math" w:eastAsiaTheme="minorEastAsia" w:hAnsi="Cambria Math"/>
+                    <w:i/>
+                  </w:rPr>
+                </m:ctrlPr>
+              </m:sSubPr>
+              <m:e>
+                <m:r>
+                  <w:rPr>
+                    <w:rFonts w:ascii="Cambria Math" w:eastAsiaTheme="minorEastAsia" w:hAnsi="Cambria Math"/>
+                  </w:rPr>
+                  <m:t>V</m:t>
+                </m:r>
+              </m:e>
+              <m:sub>
+                <m:r>
+                  <w:rPr>
+                    <w:rFonts w:ascii="Cambria Math" w:hAnsi="Cambria Math"/>
+                  </w:rPr>
+                  <m:t>θ</m:t>
+                </m:r>
+              </m:sub>
+            </m:sSub>
+            <m:d>
+              <m:dPr>
+                <m:ctrlPr>
+                  <w:rPr>
+                    <w:rFonts w:ascii="Cambria Math" w:hAnsi="Cambria Math"/>
+                    <w:i/>
+                  </w:rPr>
+                </m:ctrlPr>
+              </m:dPr>
+              <m:e>
+                <m:r>
+                  <w:rPr>
+                    <w:rFonts w:ascii="Cambria Math" w:hAnsi="Cambria Math"/>
+                  </w:rPr>
+                  <m:t>ξ,</m:t>
+                </m:r>
+                <m:sSub>
+                  <m:sSubPr>
+                    <m:ctrlPr>
+                      <w:rPr>
+                        <w:rFonts w:ascii="Cambria Math" w:eastAsiaTheme="minorEastAsia" w:hAnsi="Cambria Math"/>
+                        <w:i/>
+                      </w:rPr>
+                    </m:ctrlPr>
+                  </m:sSubPr>
+                  <m:e>
+                    <m:r>
+                      <w:rPr>
+                        <w:rFonts w:ascii="Cambria Math" w:eastAsiaTheme="minorEastAsia" w:hAnsi="Cambria Math"/>
+                      </w:rPr>
+                      <m:t>h</m:t>
+                    </m:r>
+                  </m:e>
+                  <m:sub>
+                    <m:r>
+                      <m:rPr>
+                        <m:scr m:val="script"/>
+                      </m:rPr>
+                      <w:rPr>
+                        <w:rFonts w:ascii="Cambria Math" w:eastAsiaTheme="minorEastAsia" w:hAnsi="Cambria Math"/>
+                      </w:rPr>
+                      <m:t>l</m:t>
+                    </m:r>
+                  </m:sub>
+                </m:sSub>
+              </m:e>
+            </m:d>
+          </m:e>
+        </m:d>
+      </m:oMath>
+      <w:r>
+        <w:rPr>
+          <w:rFonts w:eastAsiaTheme="minorEastAsia"/>
+        </w:rPr>
+        <w:t xml:space="preserve"> </w:t>
+      </w:r>
+      <w:r>
+        <w:rPr>
+          <w:rFonts w:eastAsiaTheme="minorEastAsia"/>
+        </w:rPr>
+        <w:t xml:space="preserve">. Fitten by closed form least squares. In code: </w:t>
+      </w:r>
+      <w:r>
+        <w:rPr>
+          <w:rFonts w:ascii="Consolas" w:eastAsiaTheme="minorEastAsia" w:hAnsi="Consolas" w:cs="Consolas"/>
+          <w:color w:val="C00000"/>
+          <w:sz w:val="17"/>
+          <w:szCs w:val="17"/>
+        </w:rPr>
+        <w:t>alpha[ell]</w:t>
+      </w:r>
+      <w:r>
+        <w:rPr>
+          <w:rFonts w:eastAsiaTheme="minorEastAsia"/>
+        </w:rPr>
+        <w:t>.</w:t>
+      </w:r>
+    </w:p>
+    <w:p>
+      <w:pPr>
+        <w:rPr>
+          <w:rFonts w:eastAsiaTheme="minorEastAsia"/>
+        </w:rPr>
+      </w:pPr>
+    </w:p>
+    <w:p>
+      <w:pPr>
+        <w:rPr>
+          <w:rFonts w:eastAsiaTheme="minorEastAsia"/>
+        </w:rPr>
+      </w:pPr>
+      <m:oMath>
+        <m:sSub>
+          <m:sSubPr>
+            <m:ctrlPr>
+              <w:rPr>
+                <w:rFonts w:ascii="Cambria Math" w:eastAsiaTheme="minorEastAsia" w:hAnsi="Cambria Math"/>
+                <w:i/>
+              </w:rPr>
+            </m:ctrlPr>
+          </m:sSubPr>
+          <m:e>
+            <m:r>
+              <w:rPr>
+                <w:rFonts w:ascii="Cambria Math" w:eastAsiaTheme="minorEastAsia" w:hAnsi="Cambria Math"/>
+              </w:rPr>
+              <m:t>β</m:t>
+            </m:r>
+          </m:e>
+          <m:sub>
+            <m:r>
+              <m:rPr>
+                <m:scr m:val="script"/>
+              </m:rPr>
+              <w:rPr>
+                <w:rFonts w:ascii="Cambria Math" w:eastAsiaTheme="minorEastAsia" w:hAnsi="Cambria Math"/>
+              </w:rPr>
+              <m:t>l</m:t>
+            </m:r>
+          </m:sub>
+        </m:sSub>
+      </m:oMath>
+      <w:r>
+        <w:rPr>
+          <w:rFonts w:eastAsiaTheme="minorEastAsia"/>
+        </w:rPr>
+        <w:t xml:space="preserve"> - per-layer scalar coefficient on</w:t>
+      </w:r>
+      <w:r>
+        <w:rPr>
+          <w:rFonts w:eastAsiaTheme="minorEastAsia"/>
+        </w:rPr>
+        <w:t xml:space="preserve"> the conservative force </w:t>
+      </w:r>
+      <m:oMath>
+        <m:r>
+          <w:rPr>
+            <w:rFonts w:ascii="Cambria Math" w:eastAsiaTheme="minorEastAsia" w:hAnsi="Cambria Math"/>
+          </w:rPr>
+          <m:t>-</m:t>
+        </m:r>
+        <m:sSub>
+          <m:sSubPr>
+            <m:ctrlPr>
+              <w:rPr>
+                <w:rFonts w:ascii="Cambria Math" w:eastAsiaTheme="minorEastAsia" w:hAnsi="Cambria Math"/>
+                <w:i/>
+              </w:rPr>
+            </m:ctrlPr>
+          </m:sSubPr>
+          <m:e>
+            <m:r>
+              <m:rPr>
+                <m:sty m:val="p"/>
+              </m:rPr>
+              <w:rPr>
+                <w:rFonts w:ascii="Cambria Math" w:eastAsiaTheme="minorEastAsia" w:hAnsi="Cambria Math"/>
+              </w:rPr>
+              <m:t>∇</m:t>
+            </m:r>
+          </m:e>
+          <m:sub>
+            <m:r>
+              <w:rPr>
+                <w:rFonts w:ascii="Cambria Math" w:eastAsiaTheme="minorEastAsia" w:hAnsi="Cambria Math"/>
+              </w:rPr>
+              <m:t>h</m:t>
+            </m:r>
+          </m:sub>
+        </m:sSub>
+        <m:sSub>
+          <m:sSubPr>
+            <m:ctrlPr>
+              <w:rPr>
+                <w:rFonts w:ascii="Cambria Math" w:eastAsiaTheme="minorEastAsia" w:hAnsi="Cambria Math"/>
+                <w:i/>
+              </w:rPr>
+            </m:ctrlPr>
+          </m:sSubPr>
+          <m:e>
+            <m:r>
+              <w:rPr>
+                <w:rFonts w:ascii="Cambria Math" w:eastAsiaTheme="minorEastAsia" w:hAnsi="Cambria Math"/>
+              </w:rPr>
+              <m:t>V</m:t>
+            </m:r>
+          </m:e>
+          <m:sub>
+            <m:r>
+              <w:rPr>
+                <w:rFonts w:ascii="Cambria Math" w:hAnsi="Cambria Math"/>
+              </w:rPr>
+              <m:t>θ</m:t>
+            </m:r>
+          </m:sub>
+        </m:sSub>
+        <m:d>
+          <m:dPr>
+            <m:ctrlPr>
+              <w:rPr>
+                <w:rFonts w:ascii="Cambria Math" w:hAnsi="Cambria Math"/>
+                <w:i/>
+              </w:rPr>
+            </m:ctrlPr>
+          </m:dPr>
+          <m:e>
+            <m:r>
+              <w:rPr>
+                <w:rFonts w:ascii="Cambria Math" w:hAnsi="Cambria Math"/>
+              </w:rPr>
+              <m:t>ξ,</m:t>
+            </m:r>
+            <m:sSub>
+              <m:sSubPr>
+                <m:ctrlPr>
+                  <w:rPr>
+                    <w:rFonts w:ascii="Cambria Math" w:eastAsiaTheme="minorEastAsia" w:hAnsi="Cambria Math"/>
+                    <w:i/>
+                  </w:rPr>
+                </m:ctrlPr>
+              </m:sSubPr>
+              <m:e>
+                <m:r>
+                  <w:rPr>
+                    <w:rFonts w:ascii="Cambria Math" w:eastAsiaTheme="minorEastAsia" w:hAnsi="Cambria Math"/>
+                  </w:rPr>
+                  <m:t>h</m:t>
+                </m:r>
+              </m:e>
+              <m:sub>
+                <m:r>
+                  <m:rPr>
+                    <m:scr m:val="script"/>
+                  </m:rPr>
+                  <w:rPr>
+                    <w:rFonts w:ascii="Cambria Math" w:eastAsiaTheme="minorEastAsia" w:hAnsi="Cambria Math"/>
+                  </w:rPr>
+                  <m:t>l</m:t>
+                </m:r>
+              </m:sub>
+            </m:sSub>
+          </m:e>
+        </m:d>
+      </m:oMath>
+      <w:r>
+        <w:rPr>
+          <w:rFonts w:eastAsiaTheme="minorEastAsia"/>
+        </w:rPr>
+        <w:t xml:space="preserve"> in the oracle regression. Together </w:t>
+      </w:r>
+      <m:oMath>
+        <m:d>
+          <m:dPr>
+            <m:ctrlPr>
+              <w:rPr>
+                <w:rFonts w:ascii="Cambria Math" w:eastAsiaTheme="minorEastAsia" w:hAnsi="Cambria Math"/>
+                <w:i/>
+              </w:rPr>
+            </m:ctrlPr>
+          </m:dPr>
+          <m:e>
+            <m:sSub>
+              <m:sSubPr>
+                <m:ctrlPr>
+                  <w:rPr>
+                    <w:rFonts w:ascii="Cambria Math" w:eastAsiaTheme="minorEastAsia" w:hAnsi="Cambria Math"/>
+                    <w:i/>
+                  </w:rPr>
+                </m:ctrlPr>
+              </m:sSubPr>
+              <m:e>
+                <m:r>
+                  <w:rPr>
+                    <w:rFonts w:ascii="Cambria Math" w:eastAsiaTheme="minorEastAsia" w:hAnsi="Cambria Math"/>
+                  </w:rPr>
+                  <m:t>α</m:t>
+                </m:r>
+              </m:e>
+              <m:sub>
+                <m:r>
+                  <m:rPr>
+                    <m:scr m:val="script"/>
+                  </m:rPr>
+                  <w:rPr>
+                    <w:rFonts w:ascii="Cambria Math" w:eastAsiaTheme="minorEastAsia" w:hAnsi="Cambria Math"/>
+                  </w:rPr>
+                  <m:t>l</m:t>
+                </m:r>
+              </m:sub>
+            </m:sSub>
+            <m:r>
+              <w:rPr>
+                <w:rFonts w:ascii="Cambria Math" w:eastAsiaTheme="minorEastAsia" w:hAnsi="Cambria Math"/>
+              </w:rPr>
+              <m:t>,</m:t>
+            </m:r>
+            <m:sSub>
+              <m:sSubPr>
+                <m:ctrlPr>
+                  <w:rPr>
+                    <w:rFonts w:ascii="Cambria Math" w:eastAsiaTheme="minorEastAsia" w:hAnsi="Cambria Math"/>
+                    <w:i/>
+                  </w:rPr>
+                </m:ctrlPr>
+              </m:sSubPr>
+              <m:e>
+                <m:r>
+                  <w:rPr>
+                    <w:rFonts w:ascii="Cambria Math" w:eastAsiaTheme="minorEastAsia" w:hAnsi="Cambria Math"/>
+                  </w:rPr>
+                  <m:t>β</m:t>
+                </m:r>
+              </m:e>
+              <m:sub>
+                <m:r>
+                  <m:rPr>
+                    <m:scr m:val="script"/>
+                  </m:rPr>
+                  <w:rPr>
+                    <w:rFonts w:ascii="Cambria Math" w:eastAsiaTheme="minorEastAsia" w:hAnsi="Cambria Math"/>
+                  </w:rPr>
+                  <m:t>l</m:t>
+                </m:r>
+              </m:sub>
+            </m:sSub>
+          </m:e>
+        </m:d>
+      </m:oMath>
+      <w:r>
+        <w:rPr>
+          <w:rFonts w:eastAsiaTheme="minorEastAsia"/>
+        </w:rPr>
+        <w:t xml:space="preserve"> measure how much of the per-layer state change </w:t>
+      </w:r>
+      <m:oMath>
+        <m:r>
+          <w:rPr>
+            <w:rFonts w:ascii="Cambria Math" w:eastAsiaTheme="minorEastAsia" w:hAnsi="Cambria Math"/>
+          </w:rPr>
+          <m:t>∆</m:t>
+        </m:r>
+        <m:sSub>
+          <m:sSubPr>
+            <m:ctrlPr>
+              <w:rPr>
+                <w:rFonts w:ascii="Cambria Math" w:eastAsiaTheme="minorEastAsia" w:hAnsi="Cambria Math"/>
+                <w:i/>
+              </w:rPr>
+            </m:ctrlPr>
+          </m:sSubPr>
+          <m:e>
+            <m:r>
+              <w:rPr>
+                <w:rFonts w:ascii="Cambria Math" w:eastAsiaTheme="minorEastAsia" w:hAnsi="Cambria Math"/>
+              </w:rPr>
+              <m:t>h</m:t>
+            </m:r>
+          </m:e>
+          <m:sub>
+            <m:r>
+              <m:rPr>
+                <m:scr m:val="script"/>
+              </m:rPr>
+              <w:rPr>
+                <w:rFonts w:ascii="Cambria Math" w:eastAsiaTheme="minorEastAsia" w:hAnsi="Cambria Math"/>
+              </w:rPr>
+              <m:t>l</m:t>
+            </m:r>
+          </m:sub>
+        </m:sSub>
+      </m:oMath>
+      <w:r>
+        <w:rPr>
+          <w:rFonts w:eastAsiaTheme="minorEastAsia"/>
+        </w:rPr>
+        <w:t xml:space="preserve"> is explained by the model’s own learned potential. In code: </w:t>
+      </w:r>
+      <w:r>
+        <w:rPr>
+          <w:rFonts w:ascii="Consolas" w:eastAsiaTheme="minorEastAsia" w:hAnsi="Consolas" w:cs="Consolas"/>
+          <w:color w:val="C00000"/>
+          <w:sz w:val="17"/>
+          <w:szCs w:val="17"/>
+        </w:rPr>
+        <w:t>beta[ell]</w:t>
+      </w:r>
+      <w:r>
+        <w:rPr>
+          <w:rFonts w:eastAsiaTheme="minorEastAsia"/>
+        </w:rPr>
+        <w:t>.</w:t>
+      </w:r>
+    </w:p>
+    <w:p>
+      <w:pPr>
+        <w:rPr>
+          <w:rFonts w:eastAsiaTheme="minorEastAsia"/>
+        </w:rPr>
+      </w:pPr>
+    </w:p>
+    <w:p>
+      <w:pPr>
+        <w:rPr>
+          <w:rFonts w:eastAsiaTheme="minorEastAsia"/>
+        </w:rPr>
+      </w:pPr>
+      <m:oMath>
+        <m:sSup>
+          <m:sSupPr>
+            <m:ctrlPr>
+              <w:rPr>
+                <w:rFonts w:ascii="Cambria Math" w:eastAsiaTheme="minorEastAsia" w:hAnsi="Cambria Math"/>
+                <w:i/>
+              </w:rPr>
+            </m:ctrlPr>
+          </m:sSupPr>
+          <m:e>
+            <m:r>
+              <w:rPr>
+                <w:rFonts w:ascii="Cambria Math" w:eastAsiaTheme="minorEastAsia" w:hAnsi="Cambria Math"/>
+              </w:rPr>
+              <m:t>R</m:t>
+            </m:r>
+          </m:e>
+          <m:sup>
+            <m:r>
+              <w:rPr>
+                <w:rFonts w:ascii="Cambria Math" w:eastAsiaTheme="minorEastAsia" w:hAnsi="Cambria Math"/>
+              </w:rPr>
+              <m:t>2</m:t>
+            </m:r>
+          </m:sup>
+        </m:sSup>
+      </m:oMath>
+      <w:r>
+        <w:rPr>
+          <w:rFonts w:eastAsiaTheme="minorEastAsia"/>
+        </w:rPr>
+        <w:t xml:space="preserve"> – Shared-potential </w:t>
+      </w:r>
+      <m:oMath>
+        <m:sSup>
+          <m:sSupPr>
+            <m:ctrlPr>
+              <w:rPr>
+                <w:rFonts w:ascii="Cambria Math" w:eastAsiaTheme="minorEastAsia" w:hAnsi="Cambria Math"/>
+                <w:i/>
+              </w:rPr>
+            </m:ctrlPr>
+          </m:sSupPr>
+          <m:e>
+            <m:r>
+              <w:rPr>
+                <w:rFonts w:ascii="Cambria Math" w:eastAsiaTheme="minorEastAsia" w:hAnsi="Cambria Math"/>
+              </w:rPr>
+              <m:t>R</m:t>
+            </m:r>
+          </m:e>
+          <m:sup>
+            <m:r>
+              <w:rPr>
+                <w:rFonts w:ascii="Cambria Math" w:eastAsiaTheme="minorEastAsia" w:hAnsi="Cambria Math"/>
+              </w:rPr>
+              <m:t>2</m:t>
+            </m:r>
+          </m:sup>
+        </m:sSup>
+      </m:oMath>
+      <w:r>
+        <w:rPr>
+          <w:rFonts w:eastAsiaTheme="minorEastAsia"/>
+        </w:rPr>
+        <w:t xml:space="preserve"> separator: fraction of variance in </w:t>
+      </w:r>
+      <m:oMath>
+        <m:r>
+          <w:rPr>
+            <w:rFonts w:ascii="Cambria Math" w:eastAsiaTheme="minorEastAsia" w:hAnsi="Cambria Math"/>
+          </w:rPr>
+          <m:t>∆</m:t>
+        </m:r>
+        <m:sSub>
+          <m:sSubPr>
+            <m:ctrlPr>
+              <w:rPr>
+                <w:rFonts w:ascii="Cambria Math" w:eastAsiaTheme="minorEastAsia" w:hAnsi="Cambria Math"/>
+                <w:i/>
+              </w:rPr>
+            </m:ctrlPr>
+          </m:sSubPr>
+          <m:e>
+            <m:r>
+              <w:rPr>
+                <w:rFonts w:ascii="Cambria Math" w:eastAsiaTheme="minorEastAsia" w:hAnsi="Cambria Math"/>
+              </w:rPr>
+              <m:t>h</m:t>
+            </m:r>
+          </m:e>
+          <m:sub>
+            <m:r>
+              <m:rPr>
+                <m:scr m:val="script"/>
+              </m:rPr>
+              <w:rPr>
+                <w:rFonts w:ascii="Cambria Math" w:eastAsiaTheme="minorEastAsia" w:hAnsi="Cambria Math"/>
+              </w:rPr>
+              <m:t>l</m:t>
+            </m:r>
+          </m:sub>
+        </m:sSub>
+      </m:oMath>
+      <w:r>
+        <w:rPr>
+          <w:rFonts w:eastAsiaTheme="minorEastAsia"/>
+        </w:rPr>
+        <w:t xml:space="preserve"> explained by the two-scalar model. Values near 1.0 indicate the dynamics is well-described by </w:t>
+      </w:r>
+      <m:oMath>
+        <m:sSub>
+          <m:sSubPr>
+            <m:ctrlPr>
+              <w:rPr>
+                <w:rFonts w:ascii="Cambria Math" w:eastAsiaTheme="minorEastAsia" w:hAnsi="Cambria Math"/>
+                <w:i/>
+              </w:rPr>
+            </m:ctrlPr>
+          </m:sSubPr>
+          <m:e>
+            <m:r>
+              <w:rPr>
+                <w:rFonts w:ascii="Cambria Math" w:eastAsiaTheme="minorEastAsia" w:hAnsi="Cambria Math"/>
+              </w:rPr>
+              <m:t>V</m:t>
+            </m:r>
+          </m:e>
+          <m:sub>
+            <m:r>
+              <w:rPr>
+                <w:rFonts w:ascii="Cambria Math" w:hAnsi="Cambria Math"/>
+              </w:rPr>
+              <m:t>θ</m:t>
+            </m:r>
+          </m:sub>
+        </m:sSub>
+      </m:oMath>
+      <w:r>
+        <w:rPr>
+          <w:rFonts w:eastAsiaTheme="minorEastAsia"/>
+        </w:rPr>
+        <w:t>; values near 0 indicate the model’s potential does not explain the layer-to-layer transitions.</w:t>
+      </w:r>
+    </w:p>
+    <w:p>
+      <w:pPr>
+        <w:rPr>
+          <w:rFonts w:eastAsiaTheme="minorEastAsia"/>
+        </w:rPr>
+      </w:pPr>
+    </w:p>
+    <w:p>
+      <w:pPr>
+        <w:rPr>
+          <w:rFonts w:eastAsiaTheme="minorEastAsia"/>
+        </w:rPr>
+      </w:pPr>
+      <m:oMath>
+        <m:r>
+          <w:rPr>
+            <w:rFonts w:ascii="Cambria Math" w:eastAsiaTheme="minorEastAsia" w:hAnsi="Cambria Math"/>
+          </w:rPr>
+          <m:t>H</m:t>
+        </m:r>
+      </m:oMath>
+      <w:r>
+        <w:rPr>
+          <w:rFonts w:eastAsiaTheme="minorEastAsia"/>
+        </w:rPr>
+        <w:t xml:space="preserve"> – raw hidden-state trajectory extracted from a single sentence, tensor with shape </w:t>
+      </w:r>
+      <m:oMath>
+        <m:r>
+          <w:rPr>
+            <w:rFonts w:ascii="Cambria Math" w:eastAsiaTheme="minorEastAsia" w:hAnsi="Cambria Math"/>
+          </w:rPr>
+          <m:t>(L+1, T, d)</m:t>
+        </m:r>
+      </m:oMath>
+      <w:r>
+        <w:rPr>
+          <w:rFonts w:eastAsiaTheme="minorEastAsia"/>
+        </w:rPr>
+        <w:t xml:space="preserve">. In code: </w:t>
+      </w:r>
+      <w:r>
+        <w:rPr>
+          <w:rFonts w:ascii="Consolas" w:eastAsiaTheme="minorEastAsia" w:hAnsi="Consolas" w:cs="Consolas"/>
+          <w:color w:val="C00000"/>
+          <w:sz w:val="17"/>
+          <w:szCs w:val="17"/>
+        </w:rPr>
+        <w:t>H</w:t>
+      </w:r>
+      <w:r>
+        <w:rPr>
+          <w:rFonts w:eastAsiaTheme="minorEastAsia"/>
+        </w:rPr>
+        <w:t>.</w:t>
+      </w:r>
+    </w:p>
+    <w:p>
+      <w:pPr>
+        <w:rPr>
+          <w:rFonts w:eastAsiaTheme="minorEastAsia"/>
+        </w:rPr>
+      </w:pPr>
+    </w:p>
+    <w:p>
+      <w:pPr>
+        <w:rPr>
+          <w:rFonts w:eastAsiaTheme="minorEastAsia"/>
+        </w:rPr>
+      </w:pPr>
+      <m:oMath>
+        <m:r>
+          <w:rPr>
+            <w:rFonts w:ascii="Cambria Math" w:eastAsiaTheme="minorEastAsia" w:hAnsi="Cambria Math"/>
+          </w:rPr>
+          <m:t>GV</m:t>
+        </m:r>
+      </m:oMath>
+      <w:r>
+        <w:rPr>
+          <w:rFonts w:eastAsiaTheme="minorEastAsia"/>
+        </w:rPr>
+        <w:t xml:space="preserve"> – gradient of </w:t>
+      </w:r>
+      <m:oMath>
+        <m:sSub>
+          <m:sSubPr>
+            <m:ctrlPr>
+              <w:rPr>
+                <w:rFonts w:ascii="Cambria Math" w:eastAsiaTheme="minorEastAsia" w:hAnsi="Cambria Math"/>
+                <w:i/>
+              </w:rPr>
+            </m:ctrlPr>
+          </m:sSubPr>
+          <m:e>
+            <m:r>
+              <w:rPr>
+                <w:rFonts w:ascii="Cambria Math" w:eastAsiaTheme="minorEastAsia" w:hAnsi="Cambria Math"/>
+              </w:rPr>
+              <m:t>V</m:t>
+            </m:r>
+          </m:e>
+          <m:sub>
+            <m:r>
+              <w:rPr>
+                <w:rFonts w:ascii="Cambria Math" w:hAnsi="Cambria Math"/>
+              </w:rPr>
+              <m:t>θ</m:t>
+            </m:r>
+          </m:sub>
+        </m:sSub>
+      </m:oMath>
+      <w:r>
+        <w:rPr>
+          <w:rFonts w:eastAsiaTheme="minorEastAsia"/>
+        </w:rPr>
+        <w:t xml:space="preserve"> at each integration step i.e. </w:t>
+      </w:r>
+      <m:oMath>
+        <m:sSub>
+          <m:sSubPr>
+            <m:ctrlPr>
+              <w:rPr>
+                <w:rFonts w:ascii="Cambria Math" w:eastAsiaTheme="minorEastAsia" w:hAnsi="Cambria Math"/>
+                <w:i/>
+              </w:rPr>
+            </m:ctrlPr>
+          </m:sSubPr>
+          <m:e>
+            <m:r>
+              <m:rPr>
+                <m:sty m:val="p"/>
+              </m:rPr>
+              <w:rPr>
+                <w:rFonts w:ascii="Cambria Math" w:eastAsiaTheme="minorEastAsia" w:hAnsi="Cambria Math"/>
+              </w:rPr>
+              <m:t>∇</m:t>
+            </m:r>
+          </m:e>
+          <m:sub>
+            <m:r>
+              <w:rPr>
+                <w:rFonts w:ascii="Cambria Math" w:eastAsiaTheme="minorEastAsia" w:hAnsi="Cambria Math"/>
+              </w:rPr>
+              <m:t>h</m:t>
+            </m:r>
+          </m:sub>
+        </m:sSub>
+        <m:sSub>
+          <m:sSubPr>
+            <m:ctrlPr>
+              <w:rPr>
+                <w:rFonts w:ascii="Cambria Math" w:eastAsiaTheme="minorEastAsia" w:hAnsi="Cambria Math"/>
+                <w:i/>
+              </w:rPr>
+            </m:ctrlPr>
+          </m:sSubPr>
+          <m:e>
+            <m:r>
+              <w:rPr>
+                <w:rFonts w:ascii="Cambria Math" w:eastAsiaTheme="minorEastAsia" w:hAnsi="Cambria Math"/>
+              </w:rPr>
+              <m:t>V</m:t>
+            </m:r>
+          </m:e>
+          <m:sub>
+            <m:r>
+              <w:rPr>
+                <w:rFonts w:ascii="Cambria Math" w:hAnsi="Cambria Math"/>
+              </w:rPr>
+              <m:t>θ</m:t>
+            </m:r>
+          </m:sub>
+        </m:sSub>
+        <m:d>
+          <m:dPr>
+            <m:ctrlPr>
+              <w:rPr>
+                <w:rFonts w:ascii="Cambria Math" w:hAnsi="Cambria Math"/>
+                <w:i/>
+              </w:rPr>
+            </m:ctrlPr>
+          </m:dPr>
+          <m:e>
+            <m:sSub>
+              <m:sSubPr>
+                <m:ctrlPr>
+                  <w:rPr>
+                    <w:rFonts w:ascii="Cambria Math" w:hAnsi="Cambria Math"/>
+                    <w:i/>
+                  </w:rPr>
+                </m:ctrlPr>
+              </m:sSubPr>
+              <m:e>
+                <m:r>
+                  <w:rPr>
+                    <w:rFonts w:ascii="Cambria Math" w:hAnsi="Cambria Math"/>
+                  </w:rPr>
+                  <m:t>ξ</m:t>
+                </m:r>
+              </m:e>
+              <m:sub>
+                <m:r>
+                  <m:rPr>
+                    <m:scr m:val="script"/>
+                  </m:rPr>
+                  <w:rPr>
+                    <w:rFonts w:ascii="Cambria Math" w:eastAsiaTheme="minorEastAsia" w:hAnsi="Cambria Math"/>
+                  </w:rPr>
+                  <m:t>l</m:t>
+                </m:r>
+              </m:sub>
+            </m:sSub>
+            <m:r>
+              <w:rPr>
+                <w:rFonts w:ascii="Cambria Math" w:hAnsi="Cambria Math"/>
+              </w:rPr>
+              <m:t>,</m:t>
+            </m:r>
+            <m:sSub>
+              <m:sSubPr>
+                <m:ctrlPr>
+                  <w:rPr>
+                    <w:rFonts w:ascii="Cambria Math" w:eastAsiaTheme="minorEastAsia" w:hAnsi="Cambria Math"/>
+                    <w:i/>
+                  </w:rPr>
+                </m:ctrlPr>
+              </m:sSubPr>
+              <m:e>
+                <m:r>
+                  <w:rPr>
+                    <w:rFonts w:ascii="Cambria Math" w:eastAsiaTheme="minorEastAsia" w:hAnsi="Cambria Math"/>
+                  </w:rPr>
+                  <m:t>h</m:t>
+                </m:r>
+              </m:e>
+              <m:sub>
+                <m:r>
+                  <m:rPr>
+                    <m:scr m:val="script"/>
+                  </m:rPr>
+                  <w:rPr>
+                    <w:rFonts w:ascii="Cambria Math" w:eastAsiaTheme="minorEastAsia" w:hAnsi="Cambria Math"/>
+                  </w:rPr>
+                  <m:t>l</m:t>
+                </m:r>
+              </m:sub>
+            </m:sSub>
+          </m:e>
+        </m:d>
+      </m:oMath>
+      <w:r>
+        <w:rPr>
+          <w:rFonts w:eastAsiaTheme="minorEastAsia"/>
+        </w:rPr>
+        <w:t>.</w:t>
+      </w:r>
+      <w:r>
+        <w:rPr>
+          <w:rFonts w:eastAsiaTheme="minorEastAsia"/>
+        </w:rPr>
+        <w:t xml:space="preserve"> </w:t>
+      </w:r>
+      <w:r>
+        <w:rPr>
+          <w:rFonts w:eastAsiaTheme="minorEastAsia"/>
+        </w:rPr>
+        <w:t xml:space="preserve">tensor with shape </w:t>
+      </w:r>
+      <m:oMath>
+        <m:r>
+          <w:rPr>
+            <w:rFonts w:ascii="Cambria Math" w:eastAsiaTheme="minorEastAsia" w:hAnsi="Cambria Math"/>
+          </w:rPr>
+          <m:t>(L, T, d)</m:t>
+        </m:r>
+      </m:oMath>
+      <w:r>
+        <w:rPr>
+          <w:rFonts w:eastAsiaTheme="minorEastAsia"/>
+        </w:rPr>
+        <w:t xml:space="preserve">. In code: </w:t>
+      </w:r>
+      <w:r>
+        <w:rPr>
+          <w:rFonts w:ascii="Consolas" w:eastAsiaTheme="minorEastAsia" w:hAnsi="Consolas" w:cs="Consolas"/>
+          <w:color w:val="C00000"/>
+          <w:sz w:val="17"/>
+          <w:szCs w:val="17"/>
+        </w:rPr>
+        <w:t>GV</w:t>
+      </w:r>
+      <w:r>
+        <w:rPr>
+          <w:rFonts w:eastAsiaTheme="minorEastAsia"/>
+        </w:rPr>
+        <w:t>.</w:t>
+      </w:r>
+    </w:p>
+    <w:p>
+      <w:pPr>
+        <w:rPr>
+          <w:rFonts w:eastAsiaTheme="minorEastAsia"/>
+        </w:rPr>
+      </w:pPr>
+    </w:p>
+    <w:p>
+      <w:pPr>
+        <w:rPr>
+          <w:rFonts w:eastAsiaTheme="minorEastAsia"/>
+        </w:rPr>
+      </w:pPr>
+      <m:oMath>
+        <m:r>
+          <m:rPr>
+            <m:sty m:val="p"/>
+          </m:rPr>
+          <w:rPr>
+            <w:rFonts w:ascii="Cambria Math" w:eastAsiaTheme="minorEastAsia" w:hAnsi="Cambria Math"/>
+          </w:rPr>
+          <m:t>Ξ</m:t>
+        </m:r>
+        <m:r>
+          <w:rPr>
+            <w:rFonts w:ascii="Cambria Math" w:eastAsiaTheme="minorEastAsia" w:hAnsi="Cambria Math"/>
+          </w:rPr>
+          <m:t>=</m:t>
+        </m:r>
+        <m:sSup>
+          <m:sSupPr>
+            <m:ctrlPr>
+              <w:rPr>
+                <w:rFonts w:ascii="Cambria Math" w:eastAsiaTheme="minorEastAsia" w:hAnsi="Cambria Math"/>
+                <w:i/>
+              </w:rPr>
+            </m:ctrlPr>
+          </m:sSupPr>
+          <m:e>
+            <m:d>
+              <m:dPr>
+                <m:begChr m:val="["/>
+                <m:endChr m:val="]"/>
+                <m:ctrlPr>
+                  <w:rPr>
+                    <w:rFonts w:ascii="Cambria Math" w:eastAsiaTheme="minorEastAsia" w:hAnsi="Cambria Math"/>
+                    <w:i/>
+                  </w:rPr>
+                </m:ctrlPr>
+              </m:dPr>
+              <m:e>
+                <m:sSub>
+                  <m:sSubPr>
+                    <m:ctrlPr>
+                      <w:rPr>
+                        <w:rFonts w:ascii="Cambria Math" w:eastAsiaTheme="minorEastAsia" w:hAnsi="Cambria Math"/>
+                        <w:i/>
+                      </w:rPr>
+                    </m:ctrlPr>
+                  </m:sSubPr>
+                  <m:e>
+                    <m:r>
+                      <w:rPr>
+                        <w:rFonts w:ascii="Cambria Math" w:hAnsi="Cambria Math"/>
+                      </w:rPr>
+                      <m:t>ξ</m:t>
+                    </m:r>
+                  </m:e>
+                  <m:sub>
+                    <m:r>
+                      <w:rPr>
+                        <w:rFonts w:ascii="Cambria Math" w:eastAsiaTheme="minorEastAsia" w:hAnsi="Cambria Math"/>
+                      </w:rPr>
+                      <m:t>1</m:t>
+                    </m:r>
+                  </m:sub>
+                </m:sSub>
+                <m:r>
+                  <w:rPr>
+                    <w:rFonts w:ascii="Cambria Math" w:eastAsiaTheme="minorEastAsia" w:hAnsi="Cambria Math"/>
+                  </w:rPr>
+                  <m:t>,…,</m:t>
+                </m:r>
+                <m:sSub>
+                  <m:sSubPr>
+                    <m:ctrlPr>
+                      <w:rPr>
+                        <w:rFonts w:ascii="Cambria Math" w:eastAsiaTheme="minorEastAsia" w:hAnsi="Cambria Math"/>
+                        <w:i/>
+                      </w:rPr>
+                    </m:ctrlPr>
+                  </m:sSubPr>
+                  <m:e>
+                    <m:r>
+                      <w:rPr>
+                        <w:rFonts w:ascii="Cambria Math" w:hAnsi="Cambria Math"/>
+                      </w:rPr>
+                      <m:t>ξ</m:t>
+                    </m:r>
+                  </m:e>
+                  <m:sub>
+                    <m:r>
+                      <w:rPr>
+                        <w:rFonts w:ascii="Cambria Math" w:eastAsiaTheme="minorEastAsia" w:hAnsi="Cambria Math"/>
+                      </w:rPr>
+                      <m:t>T</m:t>
+                    </m:r>
+                  </m:sub>
+                </m:sSub>
+              </m:e>
+            </m:d>
+          </m:e>
+          <m:sup>
+            <m:r>
+              <m:rPr>
+                <m:sty m:val="p"/>
+              </m:rPr>
+              <w:rPr>
+                <w:rFonts w:ascii="Cambria Math" w:eastAsiaTheme="minorEastAsia" w:hAnsi="Cambria Math"/>
+              </w:rPr>
+              <m:t>T</m:t>
+            </m:r>
+          </m:sup>
+        </m:sSup>
+        <m:r>
+          <w:rPr>
+            <w:rFonts w:ascii="Cambria Math" w:eastAsiaTheme="minorEastAsia" w:hAnsi="Cambria Math"/>
+          </w:rPr>
+          <m:t>∈</m:t>
+        </m:r>
+        <m:sSup>
+          <m:sSupPr>
+            <m:ctrlPr>
+              <w:rPr>
+                <w:rFonts w:ascii="Cambria Math" w:eastAsiaTheme="minorEastAsia" w:hAnsi="Cambria Math"/>
+                <w:i/>
+              </w:rPr>
+            </m:ctrlPr>
+          </m:sSupPr>
+          <m:e>
+            <m:r>
+              <m:rPr>
+                <m:scr m:val="double-struck"/>
+              </m:rPr>
+              <w:rPr>
+                <w:rFonts w:ascii="Cambria Math" w:eastAsiaTheme="minorEastAsia" w:hAnsi="Cambria Math"/>
+              </w:rPr>
+              <m:t>R</m:t>
+            </m:r>
+          </m:e>
+          <m:sup>
+            <m:r>
+              <w:rPr>
+                <w:rFonts w:ascii="Cambria Math" w:eastAsiaTheme="minorEastAsia" w:hAnsi="Cambria Math"/>
+              </w:rPr>
+              <m:t>T×d</m:t>
+            </m:r>
+          </m:sup>
+        </m:sSup>
+      </m:oMath>
+      <w:r>
+        <w:rPr>
+          <w:rFonts w:eastAsiaTheme="minorEastAsia"/>
+        </w:rPr>
+        <w:t xml:space="preserve">   - context vectors used during extraction. Tensor with shape </w:t>
+      </w:r>
+      <m:oMath>
+        <m:r>
+          <w:rPr>
+            <w:rFonts w:ascii="Cambria Math" w:eastAsiaTheme="minorEastAsia" w:hAnsi="Cambria Math"/>
+          </w:rPr>
+          <m:t>(T, d)</m:t>
+        </m:r>
+      </m:oMath>
+      <w:r>
+        <w:rPr>
+          <w:rFonts w:eastAsiaTheme="minorEastAsia"/>
+        </w:rPr>
+        <w:t>.</w:t>
+      </w:r>
+      <w:r>
+        <w:rPr>
+          <w:rFonts w:eastAsiaTheme="minorEastAsia"/>
+        </w:rPr>
+        <w:t xml:space="preserve"> In. code: </w:t>
+      </w:r>
+      <w:r>
+        <w:rPr>
+          <w:rFonts w:ascii="Consolas" w:eastAsiaTheme="minorEastAsia" w:hAnsi="Consolas" w:cs="Consolas"/>
+          <w:color w:val="C00000"/>
+          <w:sz w:val="17"/>
+          <w:szCs w:val="17"/>
+        </w:rPr>
+        <w:t>XI</w:t>
+      </w:r>
+      <w:r>
+        <w:rPr>
+          <w:rFonts w:eastAsiaTheme="minorEastAsia"/>
+        </w:rPr>
+        <w:t>.</w:t>
+      </w:r>
+    </w:p>
+    <w:p>
+      <w:pPr>
+        <w:rPr>
+          <w:rFonts w:eastAsiaTheme="minorEastAsia"/>
+        </w:rPr>
+      </w:pPr>
+    </w:p>
+    <w:p>
+      <w:pPr>
+        <w:rPr>
+          <w:rFonts w:eastAsiaTheme="minorEastAsia"/>
+          <w:u w:val="single"/>
+        </w:rPr>
+      </w:pPr>
+      <w:r>
+        <w:rPr>
+          <w:rFonts w:eastAsiaTheme="minorEastAsia"/>
+          <w:u w:val="single"/>
+        </w:rPr>
+        <w:t>Disambiguation of the context-vector subscript</w:t>
+      </w:r>
+    </w:p>
+    <w:p>
+      <w:pPr>
+        <w:rPr>
+          <w:rFonts w:eastAsiaTheme="minorEastAsia"/>
+        </w:rPr>
+      </w:pPr>
+      <w:r>
+        <w:rPr>
+          <w:rFonts w:eastAsiaTheme="minorEastAsia"/>
+        </w:rPr>
+        <w:t xml:space="preserve">Throughout the paper </w:t>
+      </w:r>
+      <m:oMath>
+        <m:r>
+          <w:rPr>
+            <w:rFonts w:ascii="Cambria Math" w:hAnsi="Cambria Math"/>
+          </w:rPr>
+          <m:t>ξ</m:t>
+        </m:r>
+      </m:oMath>
+      <w:r>
+        <w:rPr>
+          <w:rFonts w:eastAsiaTheme="minorEastAsia"/>
+        </w:rPr>
+        <w:t xml:space="preserve"> carries a subscript whose meaning depends on which axis is being iterated:</w:t>
+      </w:r>
+    </w:p>
+    <w:p>
+      <w:pPr>
+        <w:rPr>
+          <w:rFonts w:eastAsiaTheme="minorEastAsia"/>
+        </w:rPr>
+      </w:pPr>
+    </w:p>
+    <w:p>
+      <w:pPr>
+        <w:pStyle w:val="ListParagraph"/>
+        <w:numPr>
+          <w:ilvl w:val="0"/>
+          <w:numId w:val="3"/>
+        </w:numPr>
+        <w:rPr>
+          <w:rFonts w:eastAsiaTheme="minorEastAsia"/>
+        </w:rPr>
+      </w:pPr>
+      <m:oMath>
+        <m:sSub>
+          <m:sSubPr>
+            <m:ctrlPr>
+              <w:rPr>
+                <w:rFonts w:ascii="Cambria Math" w:eastAsiaTheme="minorEastAsia" w:hAnsi="Cambria Math"/>
+                <w:i/>
+              </w:rPr>
+            </m:ctrlPr>
+          </m:sSubPr>
+          <m:e>
+            <m:r>
+              <w:rPr>
+                <w:rFonts w:ascii="Cambria Math" w:hAnsi="Cambria Math"/>
+              </w:rPr>
+              <m:t>ξ</m:t>
+            </m:r>
+          </m:e>
+          <m:sub>
+            <m:r>
+              <w:rPr>
+                <w:rFonts w:ascii="Cambria Math" w:eastAsiaTheme="minorEastAsia" w:hAnsi="Cambria Math"/>
+              </w:rPr>
+              <m:t>t</m:t>
+            </m:r>
+          </m:sub>
+        </m:sSub>
+      </m:oMath>
+      <w:r>
+        <w:rPr>
+          <w:rFonts w:eastAsiaTheme="minorEastAsia"/>
+        </w:rPr>
+        <w:t xml:space="preserve"> – context indexed by </w:t>
+      </w:r>
+      <w:r>
+        <w:rPr>
+          <w:rFonts w:eastAsiaTheme="minorEastAsia"/>
+          <w:i/>
+          <w:iCs/>
+        </w:rPr>
+        <w:t>token position</w:t>
+      </w:r>
+      <w:r>
+        <w:rPr>
+          <w:rFonts w:eastAsiaTheme="minorEastAsia"/>
+        </w:rPr>
+        <w:t xml:space="preserve"> </w:t>
+      </w:r>
+      <m:oMath>
+        <m:r>
+          <w:rPr>
+            <w:rFonts w:ascii="Cambria Math" w:eastAsiaTheme="minorEastAsia" w:hAnsi="Cambria Math"/>
+          </w:rPr>
+          <m:t>t∈</m:t>
+        </m:r>
+        <m:d>
+          <m:dPr>
+            <m:begChr m:val="{"/>
+            <m:endChr m:val="}"/>
+            <m:ctrlPr>
+              <w:rPr>
+                <w:rFonts w:ascii="Cambria Math" w:eastAsiaTheme="minorEastAsia" w:hAnsi="Cambria Math"/>
+                <w:i/>
+              </w:rPr>
+            </m:ctrlPr>
+          </m:dPr>
+          <m:e>
+            <m:r>
+              <w:rPr>
+                <w:rFonts w:ascii="Cambria Math" w:eastAsiaTheme="minorEastAsia" w:hAnsi="Cambria Math"/>
+              </w:rPr>
+              <m:t>1,…,T</m:t>
+            </m:r>
+          </m:e>
+        </m:d>
+      </m:oMath>
+      <w:r>
+        <w:rPr>
+          <w:rFonts w:eastAsiaTheme="minorEastAsia"/>
+        </w:rPr>
+        <w:t xml:space="preserve">. This is the natural index when the model processes a fixed layer step by step through the sequence;  </w:t>
+      </w:r>
+      <m:oMath>
+        <m:sSub>
+          <m:sSubPr>
+            <m:ctrlPr>
+              <w:rPr>
+                <w:rFonts w:ascii="Cambria Math" w:eastAsiaTheme="minorEastAsia" w:hAnsi="Cambria Math"/>
+                <w:i/>
+              </w:rPr>
+            </m:ctrlPr>
+          </m:sSubPr>
+          <m:e>
+            <m:r>
+              <w:rPr>
+                <w:rFonts w:ascii="Cambria Math" w:hAnsi="Cambria Math"/>
+              </w:rPr>
+              <m:t>ξ</m:t>
+            </m:r>
+          </m:e>
+          <m:sub>
+            <m:r>
+              <w:rPr>
+                <w:rFonts w:ascii="Cambria Math" w:eastAsiaTheme="minorEastAsia" w:hAnsi="Cambria Math"/>
+              </w:rPr>
+              <m:t>t</m:t>
+            </m:r>
+          </m:sub>
+        </m:sSub>
+        <m:r>
+          <w:rPr>
+            <w:rFonts w:ascii="Cambria Math" w:eastAsiaTheme="minorEastAsia" w:hAnsi="Cambria Math"/>
+          </w:rPr>
+          <m:t>∈</m:t>
+        </m:r>
+        <m:sSup>
+          <m:sSupPr>
+            <m:ctrlPr>
+              <w:rPr>
+                <w:rFonts w:ascii="Cambria Math" w:eastAsiaTheme="minorEastAsia" w:hAnsi="Cambria Math"/>
+                <w:i/>
+              </w:rPr>
+            </m:ctrlPr>
+          </m:sSupPr>
+          <m:e>
+            <m:r>
+              <m:rPr>
+                <m:scr m:val="double-struck"/>
+              </m:rPr>
+              <w:rPr>
+                <w:rFonts w:ascii="Cambria Math" w:eastAsiaTheme="minorEastAsia" w:hAnsi="Cambria Math"/>
+              </w:rPr>
+              <m:t>R</m:t>
+            </m:r>
+          </m:e>
+          <m:sup>
+            <m:r>
+              <w:rPr>
+                <w:rFonts w:ascii="Cambria Math" w:eastAsiaTheme="minorEastAsia" w:hAnsi="Cambria Math"/>
+              </w:rPr>
+              <m:t>K×d</m:t>
+            </m:r>
+          </m:sup>
+        </m:sSup>
+      </m:oMath>
+      <w:r>
+        <w:rPr>
+          <w:rFonts w:eastAsiaTheme="minorEastAsia"/>
+        </w:rPr>
+        <w:t xml:space="preserve"> is the </w:t>
+      </w:r>
+      <m:oMath>
+        <m:r>
+          <w:rPr>
+            <w:rFonts w:ascii="Cambria Math" w:eastAsiaTheme="minorEastAsia" w:hAnsi="Cambria Math"/>
+          </w:rPr>
+          <m:t>K</m:t>
+        </m:r>
+      </m:oMath>
+      <w:r>
+        <w:rPr>
+          <w:rFonts w:eastAsiaTheme="minorEastAsia"/>
+        </w:rPr>
+        <w:t xml:space="preserve">-channel context summary accumulated up to position </w:t>
+      </w:r>
+      <m:oMath>
+        <m:r>
+          <w:rPr>
+            <w:rFonts w:ascii="Cambria Math" w:eastAsiaTheme="minorEastAsia" w:hAnsi="Cambria Math"/>
+          </w:rPr>
+          <m:t>t</m:t>
+        </m:r>
+      </m:oMath>
+      <w:r>
+        <w:rPr>
+          <w:rFonts w:eastAsiaTheme="minorEastAsia"/>
+        </w:rPr>
+        <w:t>.</w:t>
+      </w:r>
+    </w:p>
+    <w:p>
+      <w:pPr>
+        <w:pStyle w:val="ListParagraph"/>
+        <w:numPr>
+          <w:ilvl w:val="0"/>
+          <w:numId w:val="3"/>
+        </w:numPr>
+        <w:rPr>
+          <w:rFonts w:eastAsiaTheme="minorEastAsia"/>
+        </w:rPr>
+      </w:pPr>
+      <m:oMath>
+        <m:sSub>
+          <m:sSubPr>
+            <m:ctrlPr>
+              <w:rPr>
+                <w:rFonts w:ascii="Cambria Math" w:eastAsiaTheme="minorEastAsia" w:hAnsi="Cambria Math"/>
+                <w:i/>
+              </w:rPr>
+            </m:ctrlPr>
+          </m:sSubPr>
+          <m:e>
+            <m:r>
+              <w:rPr>
+                <w:rFonts w:ascii="Cambria Math" w:hAnsi="Cambria Math"/>
+              </w:rPr>
+              <m:t>ξ</m:t>
+            </m:r>
+          </m:e>
+          <m:sub>
+            <m:r>
+              <m:rPr>
+                <m:scr m:val="script"/>
+              </m:rPr>
+              <w:rPr>
+                <w:rFonts w:ascii="Cambria Math" w:eastAsiaTheme="minorEastAsia" w:hAnsi="Cambria Math"/>
+              </w:rPr>
+              <m:t>l</m:t>
+            </m:r>
+          </m:sub>
+        </m:sSub>
+      </m:oMath>
+      <w:r>
+        <w:rPr>
+          <w:rFonts w:eastAsiaTheme="minorEastAsia"/>
+        </w:rPr>
+        <w:t xml:space="preserve"> – context</w:t>
+      </w:r>
+      <w:r>
+        <w:rPr>
+          <w:rFonts w:eastAsiaTheme="minorEastAsia"/>
+        </w:rPr>
+        <w:t xml:space="preserve"> indexed by layer depth </w:t>
+      </w:r>
+      <m:oMath>
+        <m:r>
+          <m:rPr>
+            <m:scr m:val="script"/>
+          </m:rPr>
+          <w:rPr>
+            <w:rFonts w:ascii="Cambria Math" w:eastAsiaTheme="minorEastAsia" w:hAnsi="Cambria Math"/>
+          </w:rPr>
+          <m:t>l</m:t>
+        </m:r>
+        <m:r>
+          <w:rPr>
+            <w:rFonts w:ascii="Cambria Math" w:eastAsiaTheme="minorEastAsia" w:hAnsi="Cambria Math"/>
+          </w:rPr>
+          <m:t>∈</m:t>
+        </m:r>
+        <m:d>
+          <m:dPr>
+            <m:begChr m:val="{"/>
+            <m:endChr m:val="}"/>
+            <m:ctrlPr>
+              <w:rPr>
+                <w:rFonts w:ascii="Cambria Math" w:eastAsiaTheme="minorEastAsia" w:hAnsi="Cambria Math"/>
+                <w:i/>
+              </w:rPr>
+            </m:ctrlPr>
+          </m:dPr>
+          <m:e>
+            <m:r>
+              <w:rPr>
+                <w:rFonts w:ascii="Cambria Math" w:eastAsiaTheme="minorEastAsia" w:hAnsi="Cambria Math"/>
+              </w:rPr>
+              <m:t>1,…,L</m:t>
+            </m:r>
+          </m:e>
+        </m:d>
+      </m:oMath>
+      <w:r>
+        <w:rPr>
+          <w:rFonts w:eastAsiaTheme="minorEastAsia"/>
+        </w:rPr>
+        <w:t xml:space="preserve">. This is the natural index in the non-autonomous decomposition, where each layer has its own parameter block </w:t>
+      </w:r>
+      <m:oMath>
+        <m:sSub>
+          <m:sSubPr>
+            <m:ctrlPr>
+              <w:rPr>
+                <w:rFonts w:ascii="Cambria Math" w:eastAsiaTheme="minorEastAsia" w:hAnsi="Cambria Math"/>
+                <w:i/>
+              </w:rPr>
+            </m:ctrlPr>
+          </m:sSubPr>
+          <m:e>
+            <m:r>
+              <w:rPr>
+                <w:rFonts w:ascii="Cambria Math" w:eastAsiaTheme="minorEastAsia" w:hAnsi="Cambria Math"/>
+              </w:rPr>
+              <m:t>θ</m:t>
+            </m:r>
+          </m:e>
+          <m:sub>
+            <m:r>
+              <m:rPr>
+                <m:scr m:val="script"/>
+              </m:rPr>
+              <w:rPr>
+                <w:rFonts w:ascii="Cambria Math" w:eastAsiaTheme="minorEastAsia" w:hAnsi="Cambria Math"/>
+              </w:rPr>
+              <m:t>l</m:t>
+            </m:r>
+          </m:sub>
+        </m:sSub>
+      </m:oMath>
+      <w:r>
+        <w:rPr>
+          <w:rFonts w:eastAsiaTheme="minorEastAsia"/>
+        </w:rPr>
+        <w:t xml:space="preserve"> and its own context slice </w:t>
+      </w:r>
+      <m:oMath>
+        <m:sSub>
+          <m:sSubPr>
+            <m:ctrlPr>
+              <w:rPr>
+                <w:rFonts w:ascii="Cambria Math" w:eastAsiaTheme="minorEastAsia" w:hAnsi="Cambria Math"/>
+                <w:i/>
+              </w:rPr>
+            </m:ctrlPr>
+          </m:sSubPr>
+          <m:e>
+            <m:r>
+              <w:rPr>
+                <w:rFonts w:ascii="Cambria Math" w:hAnsi="Cambria Math"/>
+              </w:rPr>
+              <m:t>ξ</m:t>
+            </m:r>
+          </m:e>
+          <m:sub>
+            <m:r>
+              <m:rPr>
+                <m:scr m:val="script"/>
+              </m:rPr>
+              <w:rPr>
+                <w:rFonts w:ascii="Cambria Math" w:eastAsiaTheme="minorEastAsia" w:hAnsi="Cambria Math"/>
+              </w:rPr>
+              <m:t>l</m:t>
+            </m:r>
+          </m:sub>
+        </m:sSub>
+      </m:oMath>
+      <w:r>
+        <w:rPr>
+          <w:rFonts w:eastAsiaTheme="minorEastAsia"/>
+        </w:rPr>
+        <w:t xml:space="preserve"> drawn from the prefix; together they generate depth-indexed and context-indexed non-autonomy in attention-based transformers.</w:t>
+      </w:r>
+    </w:p>
+    <w:p>
+      <w:pPr>
+        <w:rPr>
+          <w:rFonts w:eastAsiaTheme="minorEastAsia"/>
+        </w:rPr>
+      </w:pPr>
+      <w:r>
+        <w:rPr>
+          <w:rFonts w:eastAsiaTheme="minorEastAsia"/>
+        </w:rPr>
+        <w:t xml:space="preserve">In both cases </w:t>
+      </w:r>
+      <m:oMath>
+        <m:r>
+          <w:rPr>
+            <w:rFonts w:ascii="Cambria Math" w:hAnsi="Cambria Math"/>
+          </w:rPr>
+          <m:t>ξ</m:t>
+        </m:r>
+      </m:oMath>
+      <w:r>
+        <w:rPr>
+          <w:rFonts w:eastAsiaTheme="minorEastAsia"/>
+        </w:rPr>
+        <w:t xml:space="preserve"> denotes the same conceptual object – “whatever additional information </w:t>
+      </w:r>
+      <m:oMath>
+        <m:sSub>
+          <m:sSubPr>
+            <m:ctrlPr>
+              <w:rPr>
+                <w:rFonts w:ascii="Cambria Math" w:eastAsiaTheme="minorEastAsia" w:hAnsi="Cambria Math"/>
+                <w:i/>
+              </w:rPr>
+            </m:ctrlPr>
+          </m:sSubPr>
+          <m:e>
+            <m:r>
+              <w:rPr>
+                <w:rFonts w:ascii="Cambria Math" w:eastAsiaTheme="minorEastAsia" w:hAnsi="Cambria Math"/>
+              </w:rPr>
+              <m:t>V</m:t>
+            </m:r>
+          </m:e>
+          <m:sub>
+            <m:r>
+              <w:rPr>
+                <w:rFonts w:ascii="Cambria Math" w:hAnsi="Cambria Math"/>
+              </w:rPr>
+              <m:t>θ</m:t>
+            </m:r>
+          </m:sub>
+        </m:sSub>
+      </m:oMath>
+      <w:r>
+        <w:rPr>
+          <w:rFonts w:eastAsiaTheme="minorEastAsia"/>
+        </w:rPr>
+        <w:t xml:space="preserve"> receives beyond the hidden state </w:t>
+      </w:r>
+      <m:oMath>
+        <m:r>
+          <w:rPr>
+            <w:rFonts w:ascii="Cambria Math" w:eastAsiaTheme="minorEastAsia" w:hAnsi="Cambria Math"/>
+          </w:rPr>
+          <m:t>h</m:t>
+        </m:r>
+      </m:oMath>
+      <w:r>
+        <w:rPr>
+          <w:rFonts w:eastAsiaTheme="minorEastAsia"/>
+        </w:rPr>
+        <w:t xml:space="preserve">” – and </w:t>
+      </w:r>
+      <m:oMath>
+        <m:r>
+          <m:rPr>
+            <m:sty m:val="p"/>
+          </m:rPr>
+          <w:rPr>
+            <w:rFonts w:ascii="Cambria Math" w:eastAsiaTheme="minorEastAsia" w:hAnsi="Cambria Math"/>
+          </w:rPr>
+          <m:t>Ξ</m:t>
+        </m:r>
+      </m:oMath>
+      <w:r>
+        <w:rPr>
+          <w:rFonts w:eastAsiaTheme="minorEastAsia"/>
+        </w:rPr>
+        <w:t xml:space="preserve"> denotes the space from which it is drawn. The subscript signals only which axis is being varied; no new symbol is introduced.</w:t>
+      </w:r>
+    </w:p>
+    <w:p>
+      <w:pPr>
+        <w:rPr>
+          <w:rFonts w:eastAsiaTheme="minorEastAsia"/>
+        </w:rPr>
+      </w:pPr>
     </w:p>
     <w:p>
       <w:pPr>
@@ -8902,80 +11050,869 @@
           <w:rFonts w:eastAsiaTheme="minorEastAsia"/>
         </w:rPr>
       </w:pPr>
+      <w:bookmarkStart w:id="8" w:name="_Toc230812192"/>
       <w:r>
         <w:rPr>
           <w:rFonts w:eastAsiaTheme="minorEastAsia"/>
         </w:rPr>
         <w:t>Architectural Principles</w:t>
       </w:r>
-    </w:p>
-    <w:p>
-      <w:pPr>
-        <w:rPr>
-          <w:rFonts w:eastAsiaTheme="minorEastAsia"/>
-        </w:rPr>
-      </w:pPr>
-    </w:p>
-    <w:p>
-      <w:pPr>
-        <w:rPr>
-          <w:rFonts w:eastAsiaTheme="minorEastAsia"/>
-        </w:rPr>
-      </w:pPr>
-      <w:r>
-        <w:rPr>
-          <w:rFonts w:eastAsiaTheme="minorEastAsia"/>
-        </w:rPr>
-        <w:t xml:space="preserve">Weight sharing across steps: </w:t>
-      </w:r>
-    </w:p>
-    <w:p>
-      <w:pPr>
-        <w:rPr>
-          <w:rFonts w:eastAsiaTheme="minorEastAsia"/>
-        </w:rPr>
-      </w:pPr>
-    </w:p>
-    <w:p>
-      <w:pPr>
-        <w:rPr>
-          <w:rFonts w:eastAsiaTheme="minorEastAsia"/>
-        </w:rPr>
-      </w:pPr>
-      <w:r>
-        <w:rPr>
-          <w:rFonts w:eastAsiaTheme="minorEastAsia"/>
-        </w:rPr>
-        <w:t xml:space="preserve">Asymmetric role of </w:t>
-      </w:r>
-    </w:p>
-    <w:p>
-      <w:pPr>
-        <w:rPr>
-          <w:rFonts w:eastAsiaTheme="minorEastAsia"/>
-        </w:rPr>
-      </w:pPr>
-    </w:p>
-    <w:p>
-      <w:pPr>
-        <w:rPr>
-          <w:rFonts w:eastAsiaTheme="minorEastAsia"/>
-        </w:rPr>
-      </w:pPr>
-    </w:p>
-    <w:p/>
-    <w:p/>
-    <w:p>
-      <w:pPr>
-        <w:rPr>
-          <w:color w:val="EE0000"/>
-        </w:rPr>
-      </w:pPr>
-      <w:r>
-        <w:rPr>
-          <w:color w:val="EE0000"/>
-        </w:rPr>
-        <w:t>//TODO: finish the subsection on notation and intro notes</w:t>
+      <w:bookmarkEnd w:id="8"/>
+    </w:p>
+    <w:p>
+      <w:pPr>
+        <w:rPr>
+          <w:rFonts w:eastAsiaTheme="minorEastAsia"/>
+        </w:rPr>
+      </w:pPr>
+    </w:p>
+    <w:p>
+      <w:pPr>
+        <w:rPr>
+          <w:rFonts w:eastAsiaTheme="minorEastAsia"/>
+        </w:rPr>
+      </w:pPr>
+      <w:r>
+        <w:rPr>
+          <w:rFonts w:eastAsiaTheme="minorEastAsia"/>
+          <w:b/>
+          <w:bCs/>
+        </w:rPr>
+        <w:t>Weight sharing across steps</w:t>
+      </w:r>
+      <w:r>
+        <w:rPr>
+          <w:rFonts w:eastAsiaTheme="minorEastAsia"/>
+        </w:rPr>
+        <w:t>.</w:t>
+      </w:r>
+      <w:r>
+        <w:rPr>
+          <w:rFonts w:eastAsiaTheme="minorEastAsia"/>
+        </w:rPr>
+        <w:t xml:space="preserve"> </w:t>
+      </w:r>
+      <m:oMath>
+        <m:sSub>
+          <m:sSubPr>
+            <m:ctrlPr>
+              <w:rPr>
+                <w:rFonts w:ascii="Cambria Math" w:eastAsiaTheme="minorEastAsia" w:hAnsi="Cambria Math"/>
+                <w:i/>
+              </w:rPr>
+            </m:ctrlPr>
+          </m:sSubPr>
+          <m:e>
+            <m:r>
+              <w:rPr>
+                <w:rFonts w:ascii="Cambria Math" w:eastAsiaTheme="minorEastAsia" w:hAnsi="Cambria Math"/>
+              </w:rPr>
+              <m:t>V</m:t>
+            </m:r>
+          </m:e>
+          <m:sub>
+            <m:r>
+              <w:rPr>
+                <w:rFonts w:ascii="Cambria Math" w:hAnsi="Cambria Math"/>
+              </w:rPr>
+              <m:t>θ</m:t>
+            </m:r>
+          </m:sub>
+        </m:sSub>
+        <m:r>
+          <m:rPr>
+            <m:scr m:val="fraktur"/>
+          </m:rPr>
+          <w:rPr>
+            <w:rFonts w:ascii="Cambria Math" w:hAnsi="Cambria Math"/>
+          </w:rPr>
+          <m:t xml:space="preserve">, m, </m:t>
+        </m:r>
+        <m:r>
+          <w:rPr>
+            <w:rFonts w:ascii="Cambria Math" w:hAnsi="Cambria Math"/>
+          </w:rPr>
+          <m:t>γ</m:t>
+        </m:r>
+      </m:oMath>
+      <w:r>
+        <w:rPr>
+          <w:rFonts w:eastAsiaTheme="minorEastAsia"/>
+        </w:rPr>
+        <w:t xml:space="preserve"> are the same at every integration step </w:t>
+      </w:r>
+      <m:oMath>
+        <m:r>
+          <m:rPr>
+            <m:scr m:val="script"/>
+          </m:rPr>
+          <w:rPr>
+            <w:rFonts w:ascii="Cambria Math" w:eastAsiaTheme="minorEastAsia" w:hAnsi="Cambria Math"/>
+          </w:rPr>
+          <m:t>l∈</m:t>
+        </m:r>
+        <m:d>
+          <m:dPr>
+            <m:begChr m:val="{"/>
+            <m:endChr m:val="}"/>
+            <m:ctrlPr>
+              <w:rPr>
+                <w:rFonts w:ascii="Cambria Math" w:eastAsiaTheme="minorEastAsia" w:hAnsi="Cambria Math"/>
+                <w:i/>
+              </w:rPr>
+            </m:ctrlPr>
+          </m:dPr>
+          <m:e>
+            <m:r>
+              <w:rPr>
+                <w:rFonts w:ascii="Cambria Math" w:eastAsiaTheme="minorEastAsia" w:hAnsi="Cambria Math"/>
+              </w:rPr>
+              <m:t>1,…,L</m:t>
+            </m:r>
+          </m:e>
+        </m:d>
+      </m:oMath>
+      <w:r>
+        <w:rPr>
+          <w:rFonts w:eastAsiaTheme="minorEastAsia"/>
+        </w:rPr>
+        <w:t xml:space="preserve">. This is what makes the architecture “conservative by construction” – the force law is  a single shared scalar potential, not </w:t>
+      </w:r>
+      <m:oMath>
+        <m:r>
+          <w:rPr>
+            <w:rFonts w:ascii="Cambria Math" w:eastAsiaTheme="minorEastAsia" w:hAnsi="Cambria Math"/>
+          </w:rPr>
+          <m:t>L</m:t>
+        </m:r>
+      </m:oMath>
+      <w:r>
+        <w:rPr>
+          <w:rFonts w:eastAsiaTheme="minorEastAsia"/>
+        </w:rPr>
+        <w:t xml:space="preserve"> different networks. </w:t>
+      </w:r>
+    </w:p>
+    <w:p>
+      <w:pPr>
+        <w:rPr>
+          <w:rFonts w:eastAsiaTheme="minorEastAsia"/>
+        </w:rPr>
+      </w:pPr>
+    </w:p>
+    <w:p>
+      <w:pPr>
+        <w:rPr>
+          <w:rFonts w:eastAsiaTheme="minorEastAsia"/>
+        </w:rPr>
+      </w:pPr>
+      <w:r>
+        <w:rPr>
+          <w:rFonts w:eastAsiaTheme="minorEastAsia"/>
+          <w:b/>
+          <w:bCs/>
+        </w:rPr>
+        <w:t>Asymmetric role of</w:t>
+      </w:r>
+      <w:r>
+        <w:rPr>
+          <w:rFonts w:eastAsiaTheme="minorEastAsia"/>
+        </w:rPr>
+        <w:t xml:space="preserve"> </w:t>
+      </w:r>
+      <m:oMath>
+        <m:r>
+          <w:rPr>
+            <w:rFonts w:ascii="Cambria Math" w:hAnsi="Cambria Math"/>
+          </w:rPr>
+          <m:t>ξ</m:t>
+        </m:r>
+      </m:oMath>
+      <w:r>
+        <w:rPr>
+          <w:rFonts w:eastAsiaTheme="minorEastAsia"/>
+        </w:rPr>
+        <w:t xml:space="preserve"> </w:t>
+      </w:r>
+      <w:r>
+        <w:rPr>
+          <w:rFonts w:eastAsiaTheme="minorEastAsia"/>
+          <w:b/>
+          <w:bCs/>
+        </w:rPr>
+        <w:t>vs</w:t>
+      </w:r>
+      <w:r>
+        <w:rPr>
+          <w:rFonts w:eastAsiaTheme="minorEastAsia"/>
+        </w:rPr>
+        <w:t xml:space="preserve"> </w:t>
+      </w:r>
+      <m:oMath>
+        <m:r>
+          <w:rPr>
+            <w:rFonts w:ascii="Cambria Math" w:eastAsiaTheme="minorEastAsia" w:hAnsi="Cambria Math"/>
+          </w:rPr>
+          <m:t>h</m:t>
+        </m:r>
+      </m:oMath>
+      <w:r>
+        <w:rPr>
+          <w:rFonts w:eastAsiaTheme="minorEastAsia"/>
+        </w:rPr>
+        <w:t xml:space="preserve">. In </w:t>
+      </w:r>
+      <m:oMath>
+        <m:sSub>
+          <m:sSubPr>
+            <m:ctrlPr>
+              <w:rPr>
+                <w:rFonts w:ascii="Cambria Math" w:eastAsiaTheme="minorEastAsia" w:hAnsi="Cambria Math"/>
+                <w:i/>
+              </w:rPr>
+            </m:ctrlPr>
+          </m:sSubPr>
+          <m:e>
+            <m:r>
+              <w:rPr>
+                <w:rFonts w:ascii="Cambria Math" w:eastAsiaTheme="minorEastAsia" w:hAnsi="Cambria Math"/>
+              </w:rPr>
+              <m:t>V</m:t>
+            </m:r>
+          </m:e>
+          <m:sub>
+            <m:r>
+              <w:rPr>
+                <w:rFonts w:ascii="Cambria Math" w:hAnsi="Cambria Math"/>
+              </w:rPr>
+              <m:t>θ</m:t>
+            </m:r>
+          </m:sub>
+        </m:sSub>
+        <m:d>
+          <m:dPr>
+            <m:ctrlPr>
+              <w:rPr>
+                <w:rFonts w:ascii="Cambria Math" w:hAnsi="Cambria Math"/>
+                <w:i/>
+              </w:rPr>
+            </m:ctrlPr>
+          </m:dPr>
+          <m:e>
+            <m:r>
+              <w:rPr>
+                <w:rFonts w:ascii="Cambria Math" w:hAnsi="Cambria Math"/>
+              </w:rPr>
+              <m:t>ξ,</m:t>
+            </m:r>
+            <m:r>
+              <w:rPr>
+                <w:rFonts w:ascii="Cambria Math" w:eastAsiaTheme="minorEastAsia" w:hAnsi="Cambria Math"/>
+              </w:rPr>
+              <m:t>h</m:t>
+            </m:r>
+          </m:e>
+        </m:d>
+      </m:oMath>
+      <w:r>
+        <w:rPr>
+          <w:rFonts w:eastAsiaTheme="minorEastAsia"/>
+        </w:rPr>
+        <w:t xml:space="preserve">, </w:t>
+      </w:r>
+      <m:oMath>
+        <m:r>
+          <w:rPr>
+            <w:rFonts w:ascii="Cambria Math" w:hAnsi="Cambria Math"/>
+          </w:rPr>
+          <m:t>ξ</m:t>
+        </m:r>
+      </m:oMath>
+      <w:r>
+        <w:rPr>
+          <w:rFonts w:eastAsiaTheme="minorEastAsia"/>
+        </w:rPr>
+        <w:t xml:space="preserve"> is a frozen conditional variable (detached from the graph in the SARF variant) while </w:t>
+      </w:r>
+      <m:oMath>
+        <m:r>
+          <w:rPr>
+            <w:rFonts w:ascii="Cambria Math" w:eastAsiaTheme="minorEastAsia" w:hAnsi="Cambria Math"/>
+          </w:rPr>
+          <m:t>h</m:t>
+        </m:r>
+      </m:oMath>
+      <w:r>
+        <w:rPr>
+          <w:rFonts w:eastAsiaTheme="minorEastAsia"/>
+        </w:rPr>
+        <w:t xml:space="preserve"> is the differentiation variable. The force </w:t>
+      </w:r>
+      <m:oMath>
+        <m:r>
+          <w:rPr>
+            <w:rFonts w:ascii="Cambria Math" w:eastAsiaTheme="minorEastAsia" w:hAnsi="Cambria Math"/>
+          </w:rPr>
+          <m:t>f</m:t>
+        </m:r>
+        <m:r>
+          <w:rPr>
+            <w:rFonts w:ascii="Cambria Math" w:eastAsiaTheme="minorEastAsia" w:hAnsi="Cambria Math"/>
+          </w:rPr>
+          <m:t>=-</m:t>
+        </m:r>
+        <m:sSub>
+          <m:sSubPr>
+            <m:ctrlPr>
+              <w:rPr>
+                <w:rFonts w:ascii="Cambria Math" w:eastAsiaTheme="minorEastAsia" w:hAnsi="Cambria Math"/>
+              </w:rPr>
+            </m:ctrlPr>
+          </m:sSubPr>
+          <m:e>
+            <m:r>
+              <m:rPr>
+                <m:sty m:val="p"/>
+              </m:rPr>
+              <w:rPr>
+                <w:rFonts w:ascii="Cambria Math" w:eastAsiaTheme="minorEastAsia" w:hAnsi="Cambria Math"/>
+              </w:rPr>
+              <m:t>∇</m:t>
+            </m:r>
+          </m:e>
+          <m:sub>
+            <m:r>
+              <w:rPr>
+                <w:rFonts w:ascii="Cambria Math" w:eastAsiaTheme="minorEastAsia" w:hAnsi="Cambria Math"/>
+              </w:rPr>
+              <m:t>h</m:t>
+            </m:r>
+          </m:sub>
+        </m:sSub>
+        <m:sSub>
+          <m:sSubPr>
+            <m:ctrlPr>
+              <w:rPr>
+                <w:rFonts w:ascii="Cambria Math" w:eastAsiaTheme="minorEastAsia" w:hAnsi="Cambria Math"/>
+                <w:i/>
+              </w:rPr>
+            </m:ctrlPr>
+          </m:sSubPr>
+          <m:e>
+            <m:r>
+              <w:rPr>
+                <w:rFonts w:ascii="Cambria Math" w:eastAsiaTheme="minorEastAsia" w:hAnsi="Cambria Math"/>
+              </w:rPr>
+              <m:t>V</m:t>
+            </m:r>
+          </m:e>
+          <m:sub>
+            <m:r>
+              <w:rPr>
+                <w:rFonts w:ascii="Cambria Math" w:hAnsi="Cambria Math"/>
+              </w:rPr>
+              <m:t>θ</m:t>
+            </m:r>
+          </m:sub>
+        </m:sSub>
+      </m:oMath>
+      <w:r>
+        <w:rPr>
+          <w:rFonts w:eastAsiaTheme="minorEastAsia"/>
+        </w:rPr>
+        <w:t xml:space="preserve"> is taken only w.r.t. </w:t>
+      </w:r>
+      <m:oMath>
+        <m:r>
+          <w:rPr>
+            <w:rFonts w:ascii="Cambria Math" w:eastAsiaTheme="minorEastAsia" w:hAnsi="Cambria Math"/>
+          </w:rPr>
+          <m:t>h</m:t>
+        </m:r>
+      </m:oMath>
+      <w:r>
+        <w:rPr>
+          <w:rFonts w:eastAsiaTheme="minorEastAsia"/>
+        </w:rPr>
+        <w:t xml:space="preserve">. This makes each </w:t>
+      </w:r>
+      <m:oMath>
+        <m:sSub>
+          <m:sSubPr>
+            <m:ctrlPr>
+              <w:rPr>
+                <w:rFonts w:ascii="Cambria Math" w:eastAsiaTheme="minorEastAsia" w:hAnsi="Cambria Math"/>
+                <w:i/>
+              </w:rPr>
+            </m:ctrlPr>
+          </m:sSubPr>
+          <m:e>
+            <m:r>
+              <w:rPr>
+                <w:rFonts w:ascii="Cambria Math" w:eastAsiaTheme="minorEastAsia" w:hAnsi="Cambria Math"/>
+              </w:rPr>
+              <m:t>V</m:t>
+            </m:r>
+          </m:e>
+          <m:sub>
+            <m:r>
+              <w:rPr>
+                <w:rFonts w:ascii="Cambria Math" w:hAnsi="Cambria Math"/>
+              </w:rPr>
+              <m:t>θ</m:t>
+            </m:r>
+          </m:sub>
+        </m:sSub>
+        <m:d>
+          <m:dPr>
+            <m:ctrlPr>
+              <w:rPr>
+                <w:rFonts w:ascii="Cambria Math" w:hAnsi="Cambria Math"/>
+                <w:i/>
+              </w:rPr>
+            </m:ctrlPr>
+          </m:dPr>
+          <m:e>
+            <m:sSub>
+              <m:sSubPr>
+                <m:ctrlPr>
+                  <w:rPr>
+                    <w:rFonts w:ascii="Cambria Math" w:hAnsi="Cambria Math"/>
+                    <w:i/>
+                  </w:rPr>
+                </m:ctrlPr>
+              </m:sSubPr>
+              <m:e>
+                <m:r>
+                  <w:rPr>
+                    <w:rFonts w:ascii="Cambria Math" w:hAnsi="Cambria Math"/>
+                  </w:rPr>
+                  <m:t>ξ</m:t>
+                </m:r>
+              </m:e>
+              <m:sub>
+                <m:r>
+                  <w:rPr>
+                    <w:rFonts w:ascii="Cambria Math" w:hAnsi="Cambria Math"/>
+                  </w:rPr>
+                  <m:t>t</m:t>
+                </m:r>
+              </m:sub>
+            </m:sSub>
+            <m:r>
+              <w:rPr>
+                <w:rFonts w:ascii="Cambria Math" w:hAnsi="Cambria Math"/>
+              </w:rPr>
+              <m:t>,</m:t>
+            </m:r>
+            <m:r>
+              <w:rPr>
+                <w:rFonts w:ascii="Cambria Math" w:hAnsi="Cambria Math"/>
+              </w:rPr>
+              <m:t xml:space="preserve">  </m:t>
+            </m:r>
+            <m:r>
+              <w:rPr>
+                <w:rFonts w:ascii="Cambria Math" w:eastAsiaTheme="minorEastAsia" w:hAnsi="Cambria Math"/>
+              </w:rPr>
+              <m:t xml:space="preserve">∙ </m:t>
+            </m:r>
+          </m:e>
+        </m:d>
+      </m:oMath>
+      <w:r>
+        <w:rPr>
+          <w:rFonts w:eastAsiaTheme="minorEastAsia"/>
+        </w:rPr>
+        <w:t xml:space="preserve"> a genuine scalar potential in </w:t>
+      </w:r>
+      <m:oMath>
+        <m:r>
+          <w:rPr>
+            <w:rFonts w:ascii="Cambria Math" w:eastAsiaTheme="minorEastAsia" w:hAnsi="Cambria Math"/>
+          </w:rPr>
+          <m:t>h</m:t>
+        </m:r>
+      </m:oMath>
+      <w:r>
+        <w:rPr>
+          <w:rFonts w:eastAsiaTheme="minorEastAsia"/>
+        </w:rPr>
+        <w:t xml:space="preserve">-space for fixed </w:t>
+      </w:r>
+      <m:oMath>
+        <m:sSub>
+          <m:sSubPr>
+            <m:ctrlPr>
+              <w:rPr>
+                <w:rFonts w:ascii="Cambria Math" w:hAnsi="Cambria Math"/>
+                <w:i/>
+              </w:rPr>
+            </m:ctrlPr>
+          </m:sSubPr>
+          <m:e>
+            <m:r>
+              <w:rPr>
+                <w:rFonts w:ascii="Cambria Math" w:hAnsi="Cambria Math"/>
+              </w:rPr>
+              <m:t>ξ</m:t>
+            </m:r>
+          </m:e>
+          <m:sub>
+            <m:r>
+              <w:rPr>
+                <w:rFonts w:ascii="Cambria Math" w:hAnsi="Cambria Math"/>
+              </w:rPr>
+              <m:t>t</m:t>
+            </m:r>
+          </m:sub>
+        </m:sSub>
+      </m:oMath>
+      <w:r>
+        <w:rPr>
+          <w:rFonts w:eastAsiaTheme="minorEastAsia"/>
+        </w:rPr>
+        <w:t>.</w:t>
+      </w:r>
+    </w:p>
+    <w:p>
+      <w:pPr>
+        <w:rPr>
+          <w:rFonts w:eastAsiaTheme="minorEastAsia"/>
+        </w:rPr>
+      </w:pPr>
+    </w:p>
+    <w:p>
+      <w:pPr>
+        <w:rPr>
+          <w:rFonts w:eastAsiaTheme="minorEastAsia"/>
+        </w:rPr>
+      </w:pPr>
+      <w:r>
+        <w:rPr>
+          <w:rFonts w:eastAsiaTheme="minorEastAsia"/>
+          <w:b/>
+          <w:bCs/>
+        </w:rPr>
+        <w:t>Causal force fix</w:t>
+      </w:r>
+      <w:r>
+        <w:rPr>
+          <w:rFonts w:eastAsiaTheme="minorEastAsia"/>
+        </w:rPr>
+        <w:t xml:space="preserve"> (</w:t>
+      </w:r>
+      <w:r>
+        <w:rPr>
+          <w:rFonts w:ascii="Consolas" w:eastAsiaTheme="minorEastAsia" w:hAnsi="Consolas" w:cs="Consolas"/>
+          <w:sz w:val="17"/>
+          <w:szCs w:val="17"/>
+        </w:rPr>
+        <w:t>causal_force = True</w:t>
+      </w:r>
+      <w:r>
+        <w:rPr>
+          <w:rFonts w:eastAsiaTheme="minorEastAsia"/>
+        </w:rPr>
+        <w:t xml:space="preserve">). In the SARF variant, </w:t>
+      </w:r>
+      <m:oMath>
+        <m:r>
+          <w:rPr>
+            <w:rFonts w:ascii="Cambria Math" w:hAnsi="Cambria Math"/>
+          </w:rPr>
+          <m:t>ξ</m:t>
+        </m:r>
+      </m:oMath>
+      <w:r>
+        <w:rPr>
+          <w:rFonts w:eastAsiaTheme="minorEastAsia"/>
+        </w:rPr>
+        <w:t xml:space="preserve"> is computed from </w:t>
+      </w:r>
+      <w:r>
+        <w:rPr>
+          <w:rFonts w:ascii="Consolas" w:eastAsiaTheme="minorEastAsia" w:hAnsi="Consolas" w:cs="Consolas"/>
+          <w:color w:val="C00000"/>
+          <w:sz w:val="17"/>
+          <w:szCs w:val="17"/>
+        </w:rPr>
+        <w:t>h.detach()</w:t>
+      </w:r>
+      <w:r>
+        <w:rPr>
+          <w:rFonts w:eastAsiaTheme="minorEastAsia"/>
+        </w:rPr>
+        <w:t xml:space="preserve"> to sever the autograd path from </w:t>
+      </w:r>
+      <m:oMath>
+        <m:r>
+          <w:rPr>
+            <w:rFonts w:ascii="Cambria Math" w:hAnsi="Cambria Math"/>
+          </w:rPr>
+          <m:t>ξ</m:t>
+        </m:r>
+      </m:oMath>
+      <w:r>
+        <w:rPr>
+          <w:rFonts w:eastAsiaTheme="minorEastAsia"/>
+        </w:rPr>
+        <w:t xml:space="preserve"> back to </w:t>
+      </w:r>
+      <m:oMath>
+        <m:r>
+          <w:rPr>
+            <w:rFonts w:ascii="Cambria Math" w:eastAsiaTheme="minorEastAsia" w:hAnsi="Cambria Math"/>
+          </w:rPr>
+          <m:t>h</m:t>
+        </m:r>
+      </m:oMath>
+      <w:r>
+        <w:rPr>
+          <w:rFonts w:eastAsiaTheme="minorEastAsia"/>
+        </w:rPr>
+        <w:t xml:space="preserve">, eliminating an anti-causal gradient leak where </w:t>
+      </w:r>
+      <m:oMath>
+        <m:f>
+          <m:fPr>
+            <m:ctrlPr>
+              <w:rPr>
+                <w:rFonts w:ascii="Cambria Math" w:eastAsiaTheme="minorEastAsia" w:hAnsi="Cambria Math"/>
+                <w:i/>
+              </w:rPr>
+            </m:ctrlPr>
+          </m:fPr>
+          <m:num>
+            <m:r>
+              <w:rPr>
+                <w:rFonts w:ascii="Cambria Math" w:eastAsiaTheme="minorEastAsia" w:hAnsi="Cambria Math"/>
+              </w:rPr>
+              <m:t>∂V(</m:t>
+            </m:r>
+            <m:sSup>
+              <m:sSupPr>
+                <m:ctrlPr>
+                  <w:rPr>
+                    <w:rFonts w:ascii="Cambria Math" w:eastAsiaTheme="minorEastAsia" w:hAnsi="Cambria Math"/>
+                    <w:i/>
+                  </w:rPr>
+                </m:ctrlPr>
+              </m:sSupPr>
+              <m:e>
+                <m:r>
+                  <w:rPr>
+                    <w:rFonts w:ascii="Cambria Math" w:eastAsiaTheme="minorEastAsia" w:hAnsi="Cambria Math"/>
+                  </w:rPr>
+                  <m:t>t</m:t>
+                </m:r>
+              </m:e>
+              <m:sup>
+                <m:r>
+                  <w:rPr>
+                    <w:rFonts w:ascii="Cambria Math" w:eastAsiaTheme="minorEastAsia" w:hAnsi="Cambria Math"/>
+                  </w:rPr>
+                  <m:t>'</m:t>
+                </m:r>
+              </m:sup>
+            </m:sSup>
+            <m:r>
+              <w:rPr>
+                <w:rFonts w:ascii="Cambria Math" w:eastAsiaTheme="minorEastAsia" w:hAnsi="Cambria Math"/>
+              </w:rPr>
+              <m:t>)</m:t>
+            </m:r>
+          </m:num>
+          <m:den>
+            <m:r>
+              <w:rPr>
+                <w:rFonts w:ascii="Cambria Math" w:eastAsiaTheme="minorEastAsia" w:hAnsi="Cambria Math"/>
+              </w:rPr>
+              <m:t>∂h</m:t>
+            </m:r>
+            <m:d>
+              <m:dPr>
+                <m:ctrlPr>
+                  <w:rPr>
+                    <w:rFonts w:ascii="Cambria Math" w:eastAsiaTheme="minorEastAsia" w:hAnsi="Cambria Math"/>
+                    <w:i/>
+                  </w:rPr>
+                </m:ctrlPr>
+              </m:dPr>
+              <m:e>
+                <m:r>
+                  <w:rPr>
+                    <w:rFonts w:ascii="Cambria Math" w:eastAsiaTheme="minorEastAsia" w:hAnsi="Cambria Math"/>
+                  </w:rPr>
+                  <m:t>t</m:t>
+                </m:r>
+              </m:e>
+            </m:d>
+          </m:den>
+        </m:f>
+        <m:r>
+          <w:rPr>
+            <w:rFonts w:ascii="Cambria Math" w:eastAsiaTheme="minorEastAsia" w:hAnsi="Cambria Math"/>
+          </w:rPr>
+          <m:t>≠0</m:t>
+        </m:r>
+      </m:oMath>
+      <w:r>
+        <w:rPr>
+          <w:rFonts w:eastAsiaTheme="minorEastAsia"/>
+        </w:rPr>
+        <w:t xml:space="preserve"> for </w:t>
+      </w:r>
+      <m:oMath>
+        <m:sSup>
+          <m:sSupPr>
+            <m:ctrlPr>
+              <w:rPr>
+                <w:rFonts w:ascii="Cambria Math" w:eastAsiaTheme="minorEastAsia" w:hAnsi="Cambria Math"/>
+                <w:i/>
+              </w:rPr>
+            </m:ctrlPr>
+          </m:sSupPr>
+          <m:e>
+            <m:r>
+              <w:rPr>
+                <w:rFonts w:ascii="Cambria Math" w:eastAsiaTheme="minorEastAsia" w:hAnsi="Cambria Math"/>
+              </w:rPr>
+              <m:t>t</m:t>
+            </m:r>
+          </m:e>
+          <m:sup>
+            <m:r>
+              <w:rPr>
+                <w:rFonts w:ascii="Cambria Math" w:eastAsiaTheme="minorEastAsia" w:hAnsi="Cambria Math"/>
+              </w:rPr>
+              <m:t>'</m:t>
+            </m:r>
+          </m:sup>
+        </m:sSup>
+        <m:r>
+          <w:rPr>
+            <w:rFonts w:ascii="Cambria Math" w:eastAsiaTheme="minorEastAsia" w:hAnsi="Cambria Math"/>
+          </w:rPr>
+          <m:t>&gt;t</m:t>
+        </m:r>
+      </m:oMath>
+      <w:r>
+        <w:rPr>
+          <w:rFonts w:eastAsiaTheme="minorEastAsia"/>
+        </w:rPr>
+        <w:t>.</w:t>
+      </w:r>
+    </w:p>
+    <w:p>
+      <w:pPr>
+        <w:rPr>
+          <w:rFonts w:eastAsiaTheme="minorEastAsia"/>
+        </w:rPr>
+      </w:pPr>
+    </w:p>
+    <w:p>
+      <w:pPr>
+        <w:rPr>
+          <w:rFonts w:eastAsiaTheme="minorEastAsia"/>
+        </w:rPr>
+      </w:pPr>
+      <w:r>
+        <w:rPr>
+          <w:rFonts w:eastAsiaTheme="minorEastAsia"/>
+          <w:b/>
+          <w:bCs/>
+        </w:rPr>
+        <w:t>Tied embeddings</w:t>
+      </w:r>
+      <w:r>
+        <w:rPr>
+          <w:rFonts w:eastAsiaTheme="minorEastAsia"/>
+        </w:rPr>
+        <w:t xml:space="preserve">. The same matrix </w:t>
+      </w:r>
+      <m:oMath>
+        <m:r>
+          <w:rPr>
+            <w:rFonts w:ascii="Cambria Math" w:eastAsiaTheme="minorEastAsia" w:hAnsi="Cambria Math"/>
+          </w:rPr>
+          <m:t>E</m:t>
+        </m:r>
+      </m:oMath>
+      <w:r>
+        <w:rPr>
+          <w:rFonts w:eastAsiaTheme="minorEastAsia"/>
+        </w:rPr>
+        <w:t xml:space="preserve"> is used for both input embedding and the output projection </w:t>
+      </w:r>
+      <m:oMath>
+        <m:sSub>
+          <m:sSubPr>
+            <m:ctrlPr>
+              <w:rPr>
+                <w:rFonts w:ascii="Cambria Math" w:hAnsi="Cambria Math"/>
+                <w:i/>
+              </w:rPr>
+            </m:ctrlPr>
+          </m:sSubPr>
+          <m:e>
+            <m:r>
+              <w:rPr>
+                <w:rFonts w:ascii="Cambria Math" w:hAnsi="Cambria Math"/>
+              </w:rPr>
+              <m:t>h</m:t>
+            </m:r>
+          </m:e>
+          <m:sub>
+            <m:r>
+              <w:rPr>
+                <w:rFonts w:ascii="Cambria Math" w:hAnsi="Cambria Math"/>
+              </w:rPr>
+              <m:t>L</m:t>
+            </m:r>
+          </m:sub>
+        </m:sSub>
+        <m:r>
+          <w:rPr>
+            <w:rFonts w:ascii="Cambria Math" w:hAnsi="Cambria Math"/>
+          </w:rPr>
+          <m:t>∙</m:t>
+        </m:r>
+        <m:sSup>
+          <m:sSupPr>
+            <m:ctrlPr>
+              <w:rPr>
+                <w:rFonts w:ascii="Cambria Math" w:hAnsi="Cambria Math"/>
+                <w:i/>
+              </w:rPr>
+            </m:ctrlPr>
+          </m:sSupPr>
+          <m:e>
+            <m:r>
+              <w:rPr>
+                <w:rFonts w:ascii="Cambria Math" w:hAnsi="Cambria Math"/>
+              </w:rPr>
+              <m:t>E</m:t>
+            </m:r>
+          </m:e>
+          <m:sup>
+            <m:r>
+              <m:rPr>
+                <m:sty m:val="p"/>
+              </m:rPr>
+              <w:rPr>
+                <w:rFonts w:ascii="Cambria Math" w:hAnsi="Cambria Math"/>
+              </w:rPr>
+              <m:t>T</m:t>
+            </m:r>
+          </m:sup>
+        </m:sSup>
+      </m:oMath>
+      <w:r>
+        <w:rPr>
+          <w:rFonts w:eastAsiaTheme="minorEastAsia"/>
+        </w:rPr>
+        <w:t>, reducing parameter count and coupling the input/output representations.</w:t>
       </w:r>
     </w:p>
     <w:p/>
@@ -11596,14 +14533,14 @@
           <w:rFonts w:eastAsiaTheme="minorEastAsia"/>
         </w:rPr>
       </w:pPr>
-      <w:bookmarkStart w:id="5" w:name="_Toc230730759"/>
+      <w:bookmarkStart w:id="9" w:name="_Toc230812193"/>
       <w:r>
         <w:rPr>
           <w:rFonts w:eastAsiaTheme="minorEastAsia"/>
         </w:rPr>
         <w:t>A Note on the oracle fit</w:t>
       </w:r>
-      <w:bookmarkEnd w:id="5"/>
+      <w:bookmarkEnd w:id="9"/>
     </w:p>
     <w:p>
       <w:pPr>
@@ -12217,7 +15154,7 @@
       <w:pPr>
         <w:pStyle w:val="Heading2"/>
       </w:pPr>
-      <w:bookmarkStart w:id="6" w:name="_Toc230730760"/>
+      <w:bookmarkStart w:id="10" w:name="_Toc230812194"/>
       <w:r>
         <w:t xml:space="preserve">Training the SPLM : Learning the </w:t>
       </w:r>
@@ -12230,7 +15167,7 @@
       <w:r>
         <w:t>Scalar Potential</w:t>
       </w:r>
-      <w:bookmarkEnd w:id="6"/>
+      <w:bookmarkEnd w:id="10"/>
     </w:p>
     <w:p/>
     <w:p/>
@@ -12256,11 +15193,11 @@
         <w:lastRenderedPageBreak/>
         <w:br/>
       </w:r>
-      <w:bookmarkStart w:id="7" w:name="_Toc230730761"/>
+      <w:bookmarkStart w:id="11" w:name="_Toc230812195"/>
       <w:r>
         <w:t>References</w:t>
       </w:r>
-      <w:bookmarkEnd w:id="7"/>
+      <w:bookmarkEnd w:id="11"/>
     </w:p>
     <w:p>
       <w:pPr>
@@ -12460,18 +15397,18 @@
       <w:pPr>
         <w:pStyle w:val="Heading1"/>
       </w:pPr>
-      <w:bookmarkStart w:id="8" w:name="_Toc230730762"/>
+      <w:bookmarkStart w:id="12" w:name="_Toc230812196"/>
       <w:r>
         <w:t>Appendix</w:t>
       </w:r>
-      <w:bookmarkEnd w:id="8"/>
+      <w:bookmarkEnd w:id="12"/>
     </w:p>
     <w:p/>
     <w:p>
       <w:pPr>
         <w:pStyle w:val="Heading2"/>
       </w:pPr>
-      <w:bookmarkStart w:id="9" w:name="_Toc230730763"/>
+      <w:bookmarkStart w:id="13" w:name="_Toc230812197"/>
       <w:r>
         <w:t xml:space="preserve">Module </w:t>
       </w:r>
@@ -12487,14 +15424,14 @@
         </w:rPr>
         <w:t>.py</w:t>
       </w:r>
-      <w:bookmarkEnd w:id="9"/>
+      <w:bookmarkEnd w:id="13"/>
     </w:p>
     <w:p/>
     <w:p>
       <w:pPr>
         <w:pStyle w:val="Heading3"/>
       </w:pPr>
-      <w:bookmarkStart w:id="10" w:name="_Toc230730764"/>
+      <w:bookmarkStart w:id="14" w:name="_Toc230812198"/>
       <w:r>
         <w:t xml:space="preserve">Function </w:t>
       </w:r>
@@ -12504,7 +15441,7 @@
         </w:rPr>
         <w:t>fit_scalars</w:t>
       </w:r>
-      <w:bookmarkEnd w:id="10"/>
+      <w:bookmarkEnd w:id="14"/>
       <w:r>
         <w:t xml:space="preserve"> </w:t>
       </w:r>
@@ -13525,7 +16462,7 @@
       <w:pPr>
         <w:pStyle w:val="Heading3"/>
       </w:pPr>
-      <w:bookmarkStart w:id="11" w:name="_Toc230730765"/>
+      <w:bookmarkStart w:id="15" w:name="_Toc230812199"/>
       <w:r>
         <w:t xml:space="preserve">Function </w:t>
       </w:r>
@@ -13535,7 +16472,7 @@
         </w:rPr>
         <w:t>extract_oracle_tuples</w:t>
       </w:r>
-      <w:bookmarkEnd w:id="11"/>
+      <w:bookmarkEnd w:id="15"/>
     </w:p>
     <w:p/>
     <w:p>
@@ -16453,7 +19390,7 @@
       <w:pPr>
         <w:pStyle w:val="Heading2"/>
       </w:pPr>
-      <w:bookmarkStart w:id="12" w:name="_Toc230730766"/>
+      <w:bookmarkStart w:id="16" w:name="_Toc230812200"/>
       <w:r>
         <w:t xml:space="preserve">Module </w:t>
       </w:r>
@@ -16463,7 +19400,7 @@
         </w:rPr>
         <w:t>model.py</w:t>
       </w:r>
-      <w:bookmarkEnd w:id="12"/>
+      <w:bookmarkEnd w:id="16"/>
     </w:p>
     <w:p/>
     <w:p>
@@ -16473,7 +19410,7 @@
           <w:rFonts w:ascii="Consolas" w:hAnsi="Consolas" w:cs="Consolas"/>
         </w:rPr>
       </w:pPr>
-      <w:bookmarkStart w:id="13" w:name="_Toc230730767"/>
+      <w:bookmarkStart w:id="17" w:name="_Toc230812201"/>
       <w:r>
         <w:t xml:space="preserve">The SPLM Config : class </w:t>
       </w:r>
@@ -16483,7 +19420,7 @@
         </w:rPr>
         <w:t>SPLMConfig</w:t>
       </w:r>
-      <w:bookmarkEnd w:id="13"/>
+      <w:bookmarkEnd w:id="17"/>
     </w:p>
     <w:p/>
     <w:p>
@@ -16759,7 +19696,7 @@
       <w:pPr>
         <w:pStyle w:val="Heading3"/>
       </w:pPr>
-      <w:bookmarkStart w:id="14" w:name="_Toc230730768"/>
+      <w:bookmarkStart w:id="18" w:name="_Toc230812202"/>
       <w:r>
         <w:t xml:space="preserve">Class </w:t>
       </w:r>
@@ -16769,7 +19706,7 @@
         </w:rPr>
         <w:t>ScalarPotential</w:t>
       </w:r>
-      <w:bookmarkEnd w:id="14"/>
+      <w:bookmarkEnd w:id="18"/>
     </w:p>
     <w:p>
       <w:r>
@@ -17491,7 +20428,7 @@
       <w:pPr>
         <w:pStyle w:val="Heading3"/>
       </w:pPr>
-      <w:bookmarkStart w:id="15" w:name="_Toc230730769"/>
+      <w:bookmarkStart w:id="19" w:name="_Toc230812203"/>
       <w:r>
         <w:t xml:space="preserve">Class </w:t>
       </w:r>
@@ -17501,7 +20438,7 @@
         </w:rPr>
         <w:t>ScalarPotentialLM</w:t>
       </w:r>
-      <w:bookmarkEnd w:id="15"/>
+      <w:bookmarkEnd w:id="19"/>
     </w:p>
     <w:p/>
     <w:p>
@@ -19581,7 +22518,7 @@
       <w:pPr>
         <w:pStyle w:val="Heading2"/>
       </w:pPr>
-      <w:bookmarkStart w:id="16" w:name="_Toc230730770"/>
+      <w:bookmarkStart w:id="20" w:name="_Toc230812204"/>
       <w:r>
         <w:t xml:space="preserve">Module </w:t>
       </w:r>
@@ -19591,14 +22528,14 @@
         </w:rPr>
         <w:t>model_sarf_mass.py</w:t>
       </w:r>
-      <w:bookmarkEnd w:id="16"/>
+      <w:bookmarkEnd w:id="20"/>
     </w:p>
     <w:p/>
     <w:p>
       <w:pPr>
         <w:pStyle w:val="Heading3"/>
       </w:pPr>
-      <w:bookmarkStart w:id="17" w:name="_Toc230730771"/>
+      <w:bookmarkStart w:id="21" w:name="_Toc230812205"/>
       <w:r>
         <w:t xml:space="preserve">The SARF Config - </w:t>
       </w:r>
@@ -19611,7 +22548,7 @@
         </w:rPr>
         <w:t>SPLMSARFMassConfig</w:t>
       </w:r>
-      <w:bookmarkEnd w:id="17"/>
+      <w:bookmarkEnd w:id="21"/>
     </w:p>
     <w:p/>
     <w:p>
@@ -20117,7 +23054,7 @@
       <w:pPr>
         <w:pStyle w:val="Heading3"/>
       </w:pPr>
-      <w:bookmarkStart w:id="18" w:name="_Toc230730772"/>
+      <w:bookmarkStart w:id="22" w:name="_Toc230812206"/>
       <w:r>
         <w:t xml:space="preserve">Function </w:t>
       </w:r>
@@ -20127,7 +23064,7 @@
         </w:rPr>
         <w:t>causal_cumulative_mean</w:t>
       </w:r>
-      <w:bookmarkEnd w:id="18"/>
+      <w:bookmarkEnd w:id="22"/>
     </w:p>
     <w:p/>
     <w:p>
@@ -20349,7 +23286,7 @@
       <w:pPr>
         <w:pStyle w:val="Heading3"/>
       </w:pPr>
-      <w:bookmarkStart w:id="19" w:name="_Toc230730773"/>
+      <w:bookmarkStart w:id="23" w:name="_Toc230812207"/>
       <w:r>
         <w:t xml:space="preserve">Class </w:t>
       </w:r>
@@ -20359,7 +23296,7 @@
         </w:rPr>
         <w:t>ScalarPotentialLMSARFMass</w:t>
       </w:r>
-      <w:bookmarkEnd w:id="19"/>
+      <w:bookmarkEnd w:id="23"/>
     </w:p>
     <w:p/>
     <w:p>
@@ -25071,7 +28008,7 @@
       <w:pPr>
         <w:pStyle w:val="Heading2"/>
       </w:pPr>
-      <w:bookmarkStart w:id="20" w:name="_Toc230730774"/>
+      <w:bookmarkStart w:id="24" w:name="_Toc230812208"/>
       <w:r>
         <w:t xml:space="preserve">Module </w:t>
       </w:r>
@@ -25081,14 +28018,14 @@
         </w:rPr>
         <w:t>model_ln.py</w:t>
       </w:r>
-      <w:bookmarkEnd w:id="20"/>
+      <w:bookmarkEnd w:id="24"/>
     </w:p>
     <w:p/>
     <w:p>
       <w:pPr>
         <w:pStyle w:val="Heading2"/>
       </w:pPr>
-      <w:bookmarkStart w:id="21" w:name="_Toc230730775"/>
+      <w:bookmarkStart w:id="25" w:name="_Toc230812209"/>
       <w:r>
         <w:t xml:space="preserve">The Config Class: </w:t>
       </w:r>
@@ -25098,7 +28035,7 @@
         </w:rPr>
         <w:t>SPLMSARFMassLNConfig</w:t>
       </w:r>
-      <w:bookmarkEnd w:id="21"/>
+      <w:bookmarkEnd w:id="25"/>
     </w:p>
     <w:p>
       <w:r>
@@ -26119,9 +29056,122 @@
 <file path=word/numbering.xml><?xml version="1.0" encoding="utf-8"?>
 <w:numbering xmlns:wpc="http://schemas.microsoft.com/office/word/2010/wordprocessingCanvas" xmlns:cx="http://schemas.microsoft.com/office/drawing/2014/chartex" xmlns:cx1="http://schemas.microsoft.com/office/drawing/2015/9/8/chartex" xmlns:cx2="http://schemas.microsoft.com/office/drawing/2015/10/21/chartex" xmlns:cx3="http://schemas.microsoft.com/office/drawing/2016/5/9/chartex" xmlns:cx4="http://schemas.microsoft.com/office/drawing/2016/5/10/chartex" xmlns:cx5="http://schemas.microsoft.com/office/drawing/2016/5/11/chartex" xmlns:cx6="http://schemas.microsoft.com/office/drawing/2016/5/12/chartex" xmlns:cx7="http://schemas.microsoft.com/office/drawing/2016/5/13/chartex" xmlns:cx8="http://schemas.microsoft.com/office/drawing/2016/5/14/chartex" xmlns:mc="http://schemas.openxmlformats.org/markup-compatibility/2006" xmlns:aink="http://schemas.microsoft.com/office/drawing/2016/ink" xmlns:am3d="http://schemas.microsoft.com/office/drawing/2017/model3d" xmlns:o="urn:schemas-microsoft-com:office:office" xmlns:oel="http://schemas.microsoft.com/office/2019/extlst" xmlns:r="http://schemas.openxmlformats.org/officeDocument/2006/relationships" xmlns:m="http://schemas.openxmlformats.org/officeDocument/2006/math" xmlns:v="urn:schemas-microsoft-com:vml" xmlns:wp14="http://schemas.microsoft.com/office/word/2010/wordprocessingDrawing" xmlns:wp="http://schemas.openxmlformats.org/drawingml/2006/wordprocessingDrawing" xmlns:w10="urn:schemas-microsoft-com:office:word" xmlns:w="http://schemas.openxmlformats.org/wordprocessingml/2006/main" xmlns:w14="http://schemas.microsoft.com/office/word/2010/wordml" xmlns:w15="http://schemas.microsoft.com/office/word/2012/wordml" xmlns:w16cex="http://schemas.microsoft.com/office/word/2018/wordml/cex" xmlns:w16cid="http://schemas.microsoft.com/office/word/2016/wordml/cid" xmlns:w16="http://schemas.microsoft.com/office/word/2018/wordml" xmlns:w16du="http://schemas.microsoft.com/office/word/2023/wordml/word16du" xmlns:w16sdtdh="http://schemas.microsoft.com/office/word/2020/wordml/sdtdatahash" xmlns:w16sdtfl="http://schemas.microsoft.com/office/word/2024/wordml/sdtformatlock" xmlns:w16se="http://schemas.microsoft.com/office/word/2015/wordml/symex" xmlns:wpg="http://schemas.microsoft.com/office/word/2010/wordprocessingGroup" xmlns:wpi="http://schemas.microsoft.com/office/word/2010/wordprocessingInk" xmlns:wne="http://schemas.microsoft.com/office/word/2006/wordml" xmlns:wps="http://schemas.microsoft.com/office/word/2010/wordprocessingShape" mc:Ignorable="w14 w15 w16se w16cid w16 w16cex w16sdtdh w16sdtfl w16du wp14">
   <w:abstractNum w:abstractNumId="0" w15:restartNumberingAfterBreak="0">
-    <w:nsid w:val="4AB12156"/>
+    <w:nsid w:val="09FE0787"/>
     <w:multiLevelType w:val="hybridMultilevel"/>
-    <w:tmpl w:val="774C0E66"/>
+    <w:tmpl w:val="AD145DE4"/>
+    <w:lvl w:ilvl="0" w:tplc="C8A88FD6">
+      <w:start w:val="13"/>
+      <w:numFmt w:val="bullet"/>
+      <w:lvlText w:val=""/>
+      <w:lvlJc w:val="left"/>
+      <w:pPr>
+        <w:ind w:left="720" w:hanging="360"/>
+      </w:pPr>
+      <w:rPr>
+        <w:rFonts w:ascii="Symbol" w:eastAsiaTheme="minorEastAsia" w:hAnsi="Symbol" w:cstheme="minorBidi" w:hint="default"/>
+      </w:rPr>
+    </w:lvl>
+    <w:lvl w:ilvl="1" w:tplc="04090003" w:tentative="1">
+      <w:start w:val="1"/>
+      <w:numFmt w:val="bullet"/>
+      <w:lvlText w:val="o"/>
+      <w:lvlJc w:val="left"/>
+      <w:pPr>
+        <w:ind w:left="1440" w:hanging="360"/>
+      </w:pPr>
+      <w:rPr>
+        <w:rFonts w:ascii="Courier New" w:hAnsi="Courier New" w:cs="Courier New" w:hint="default"/>
+      </w:rPr>
+    </w:lvl>
+    <w:lvl w:ilvl="2" w:tplc="04090005" w:tentative="1">
+      <w:start w:val="1"/>
+      <w:numFmt w:val="bullet"/>
+      <w:lvlText w:val=""/>
+      <w:lvlJc w:val="left"/>
+      <w:pPr>
+        <w:ind w:left="2160" w:hanging="360"/>
+      </w:pPr>
+      <w:rPr>
+        <w:rFonts w:ascii="Wingdings" w:hAnsi="Wingdings" w:hint="default"/>
+      </w:rPr>
+    </w:lvl>
+    <w:lvl w:ilvl="3" w:tplc="04090001" w:tentative="1">
+      <w:start w:val="1"/>
+      <w:numFmt w:val="bullet"/>
+      <w:lvlText w:val=""/>
+      <w:lvlJc w:val="left"/>
+      <w:pPr>
+        <w:ind w:left="2880" w:hanging="360"/>
+      </w:pPr>
+      <w:rPr>
+        <w:rFonts w:ascii="Symbol" w:hAnsi="Symbol" w:hint="default"/>
+      </w:rPr>
+    </w:lvl>
+    <w:lvl w:ilvl="4" w:tplc="04090003" w:tentative="1">
+      <w:start w:val="1"/>
+      <w:numFmt w:val="bullet"/>
+      <w:lvlText w:val="o"/>
+      <w:lvlJc w:val="left"/>
+      <w:pPr>
+        <w:ind w:left="3600" w:hanging="360"/>
+      </w:pPr>
+      <w:rPr>
+        <w:rFonts w:ascii="Courier New" w:hAnsi="Courier New" w:cs="Courier New" w:hint="default"/>
+      </w:rPr>
+    </w:lvl>
+    <w:lvl w:ilvl="5" w:tplc="04090005" w:tentative="1">
+      <w:start w:val="1"/>
+      <w:numFmt w:val="bullet"/>
+      <w:lvlText w:val=""/>
+      <w:lvlJc w:val="left"/>
+      <w:pPr>
+        <w:ind w:left="4320" w:hanging="360"/>
+      </w:pPr>
+      <w:rPr>
+        <w:rFonts w:ascii="Wingdings" w:hAnsi="Wingdings" w:hint="default"/>
+      </w:rPr>
+    </w:lvl>
+    <w:lvl w:ilvl="6" w:tplc="04090001" w:tentative="1">
+      <w:start w:val="1"/>
+      <w:numFmt w:val="bullet"/>
+      <w:lvlText w:val=""/>
+      <w:lvlJc w:val="left"/>
+      <w:pPr>
+        <w:ind w:left="5040" w:hanging="360"/>
+      </w:pPr>
+      <w:rPr>
+        <w:rFonts w:ascii="Symbol" w:hAnsi="Symbol" w:hint="default"/>
+      </w:rPr>
+    </w:lvl>
+    <w:lvl w:ilvl="7" w:tplc="04090003" w:tentative="1">
+      <w:start w:val="1"/>
+      <w:numFmt w:val="bullet"/>
+      <w:lvlText w:val="o"/>
+      <w:lvlJc w:val="left"/>
+      <w:pPr>
+        <w:ind w:left="5760" w:hanging="360"/>
+      </w:pPr>
+      <w:rPr>
+        <w:rFonts w:ascii="Courier New" w:hAnsi="Courier New" w:cs="Courier New" w:hint="default"/>
+      </w:rPr>
+    </w:lvl>
+    <w:lvl w:ilvl="8" w:tplc="04090005" w:tentative="1">
+      <w:start w:val="1"/>
+      <w:numFmt w:val="bullet"/>
+      <w:lvlText w:val=""/>
+      <w:lvlJc w:val="left"/>
+      <w:pPr>
+        <w:ind w:left="6480" w:hanging="360"/>
+      </w:pPr>
+      <w:rPr>
+        <w:rFonts w:ascii="Wingdings" w:hAnsi="Wingdings" w:hint="default"/>
+      </w:rPr>
+    </w:lvl>
+  </w:abstractNum>
+  <w:abstractNum w:abstractNumId="1" w15:restartNumberingAfterBreak="0">
+    <w:nsid w:val="35F53F70"/>
+    <w:multiLevelType w:val="hybridMultilevel"/>
+    <w:tmpl w:val="B4C2F704"/>
     <w:lvl w:ilvl="0" w:tplc="B09CFDC8">
       <w:start w:val="13"/>
       <w:numFmt w:val="bullet"/>
@@ -26231,7 +29281,126 @@
       </w:rPr>
     </w:lvl>
   </w:abstractNum>
+  <w:abstractNum w:abstractNumId="2" w15:restartNumberingAfterBreak="0">
+    <w:nsid w:val="4AB12156"/>
+    <w:multiLevelType w:val="hybridMultilevel"/>
+    <w:tmpl w:val="774C0E66"/>
+    <w:lvl w:ilvl="0" w:tplc="B09CFDC8">
+      <w:start w:val="13"/>
+      <w:numFmt w:val="bullet"/>
+      <w:lvlText w:val="-"/>
+      <w:lvlJc w:val="left"/>
+      <w:pPr>
+        <w:ind w:left="720" w:hanging="360"/>
+      </w:pPr>
+      <w:rPr>
+        <w:rFonts w:ascii="Aptos" w:eastAsiaTheme="minorHAnsi" w:hAnsi="Aptos" w:cstheme="minorBidi" w:hint="default"/>
+      </w:rPr>
+    </w:lvl>
+    <w:lvl w:ilvl="1" w:tplc="04090003" w:tentative="1">
+      <w:start w:val="1"/>
+      <w:numFmt w:val="bullet"/>
+      <w:lvlText w:val="o"/>
+      <w:lvlJc w:val="left"/>
+      <w:pPr>
+        <w:ind w:left="1440" w:hanging="360"/>
+      </w:pPr>
+      <w:rPr>
+        <w:rFonts w:ascii="Courier New" w:hAnsi="Courier New" w:cs="Courier New" w:hint="default"/>
+      </w:rPr>
+    </w:lvl>
+    <w:lvl w:ilvl="2" w:tplc="04090005" w:tentative="1">
+      <w:start w:val="1"/>
+      <w:numFmt w:val="bullet"/>
+      <w:lvlText w:val=""/>
+      <w:lvlJc w:val="left"/>
+      <w:pPr>
+        <w:ind w:left="2160" w:hanging="360"/>
+      </w:pPr>
+      <w:rPr>
+        <w:rFonts w:ascii="Wingdings" w:hAnsi="Wingdings" w:hint="default"/>
+      </w:rPr>
+    </w:lvl>
+    <w:lvl w:ilvl="3" w:tplc="04090001" w:tentative="1">
+      <w:start w:val="1"/>
+      <w:numFmt w:val="bullet"/>
+      <w:lvlText w:val=""/>
+      <w:lvlJc w:val="left"/>
+      <w:pPr>
+        <w:ind w:left="2880" w:hanging="360"/>
+      </w:pPr>
+      <w:rPr>
+        <w:rFonts w:ascii="Symbol" w:hAnsi="Symbol" w:hint="default"/>
+      </w:rPr>
+    </w:lvl>
+    <w:lvl w:ilvl="4" w:tplc="04090003" w:tentative="1">
+      <w:start w:val="1"/>
+      <w:numFmt w:val="bullet"/>
+      <w:lvlText w:val="o"/>
+      <w:lvlJc w:val="left"/>
+      <w:pPr>
+        <w:ind w:left="3600" w:hanging="360"/>
+      </w:pPr>
+      <w:rPr>
+        <w:rFonts w:ascii="Courier New" w:hAnsi="Courier New" w:cs="Courier New" w:hint="default"/>
+      </w:rPr>
+    </w:lvl>
+    <w:lvl w:ilvl="5" w:tplc="04090005" w:tentative="1">
+      <w:start w:val="1"/>
+      <w:numFmt w:val="bullet"/>
+      <w:lvlText w:val=""/>
+      <w:lvlJc w:val="left"/>
+      <w:pPr>
+        <w:ind w:left="4320" w:hanging="360"/>
+      </w:pPr>
+      <w:rPr>
+        <w:rFonts w:ascii="Wingdings" w:hAnsi="Wingdings" w:hint="default"/>
+      </w:rPr>
+    </w:lvl>
+    <w:lvl w:ilvl="6" w:tplc="04090001" w:tentative="1">
+      <w:start w:val="1"/>
+      <w:numFmt w:val="bullet"/>
+      <w:lvlText w:val=""/>
+      <w:lvlJc w:val="left"/>
+      <w:pPr>
+        <w:ind w:left="5040" w:hanging="360"/>
+      </w:pPr>
+      <w:rPr>
+        <w:rFonts w:ascii="Symbol" w:hAnsi="Symbol" w:hint="default"/>
+      </w:rPr>
+    </w:lvl>
+    <w:lvl w:ilvl="7" w:tplc="04090003" w:tentative="1">
+      <w:start w:val="1"/>
+      <w:numFmt w:val="bullet"/>
+      <w:lvlText w:val="o"/>
+      <w:lvlJc w:val="left"/>
+      <w:pPr>
+        <w:ind w:left="5760" w:hanging="360"/>
+      </w:pPr>
+      <w:rPr>
+        <w:rFonts w:ascii="Courier New" w:hAnsi="Courier New" w:cs="Courier New" w:hint="default"/>
+      </w:rPr>
+    </w:lvl>
+    <w:lvl w:ilvl="8" w:tplc="04090005" w:tentative="1">
+      <w:start w:val="1"/>
+      <w:numFmt w:val="bullet"/>
+      <w:lvlText w:val=""/>
+      <w:lvlJc w:val="left"/>
+      <w:pPr>
+        <w:ind w:left="6480" w:hanging="360"/>
+      </w:pPr>
+      <w:rPr>
+        <w:rFonts w:ascii="Wingdings" w:hAnsi="Wingdings" w:hint="default"/>
+      </w:rPr>
+    </w:lvl>
+  </w:abstractNum>
   <w:num w:numId="1" w16cid:durableId="376583807">
+    <w:abstractNumId w:val="2"/>
+  </w:num>
+  <w:num w:numId="2" w16cid:durableId="293023387">
+    <w:abstractNumId w:val="1"/>
+  </w:num>
+  <w:num w:numId="3" w16cid:durableId="401827922">
     <w:abstractNumId w:val="0"/>
   </w:num>
 </w:numbering>
@@ -27710,7 +30879,7 @@
 </file>
 
 <file path=customXml/itemProps1.xml><?xml version="1.0" encoding="utf-8"?>
-<ds:datastoreItem xmlns:ds="http://schemas.openxmlformats.org/officeDocument/2006/customXml" ds:itemID="{AA2672C4-75E1-F141-AC4C-994C92B2E79D}">
+<ds:datastoreItem xmlns:ds="http://schemas.openxmlformats.org/officeDocument/2006/customXml" ds:itemID="{663DA9F5-7B93-704B-8610-D037019E7E1D}">
   <ds:schemaRefs>
     <ds:schemaRef ds:uri="http://schemas.openxmlformats.org/officeDocument/2006/bibliography"/>
   </ds:schemaRefs>

</xml_diff>

<commit_message>
fix laTex rendering issue
</commit_message>
<xml_diff>
--- a/docs/splm/Deep_Dive_in_the_SPLM_model_and_code.docx
+++ b/docs/splm/Deep_Dive_in_the_SPLM_model_and_code.docx
@@ -15141,6 +15141,26 @@
         <w:pStyle w:val="Heading1"/>
       </w:pPr>
     </w:p>
+    <w:p>
+      <w:r>
+        <w:t xml:space="preserve">Two observations from </w:t>
+      </w:r>
+      <w:r>
+        <w:rPr>
+          <w:rFonts w:ascii="Consolas" w:hAnsi="Consolas" w:cs="Consolas"/>
+          <w:color w:val="C00000"/>
+          <w:sz w:val="17"/>
+          <w:szCs w:val="17"/>
+        </w:rPr>
+        <w:t>extract_oracle_tuples</w:t>
+      </w:r>
+      <w:r>
+        <w:t xml:space="preserve"> (shown in the Appendix):</w:t>
+      </w:r>
+    </w:p>
+    <w:p/>
+    <w:p/>
+    <w:p/>
     <w:p>
       <w:r>
         <w:rPr>
@@ -30879,7 +30899,7 @@
 </file>
 
 <file path=customXml/itemProps1.xml><?xml version="1.0" encoding="utf-8"?>
-<ds:datastoreItem xmlns:ds="http://schemas.openxmlformats.org/officeDocument/2006/customXml" ds:itemID="{663DA9F5-7B93-704B-8610-D037019E7E1D}">
+<ds:datastoreItem xmlns:ds="http://schemas.openxmlformats.org/officeDocument/2006/customXml" ds:itemID="{3F3C3BB2-84C1-F54E-A429-8C594A32A59F}">
   <ds:schemaRefs>
     <ds:schemaRef ds:uri="http://schemas.openxmlformats.org/officeDocument/2006/bibliography"/>
   </ds:schemaRefs>

</xml_diff>